<commit_message>
Checkpoint 3: draft status, ten-weakness self-review and decisions for the PI
Co-Authored-By: Claude Opus 5.5 <noreply@anthropic.com>
Claude-Session: https://claude.ai/code/session_01Aym1Pq5EkMJZCbZQ4ygLdJ
</commit_message>
<xml_diff>
--- a/digital-twin-ivl/manuscript/manuscript.docx
+++ b/digital-twin-ivl/manuscript/manuscript.docx
@@ -23,7 +23,7 @@
         <w:t>Background/Objectives:</w:t>
       </w:r>
       <w:r>
-        <w:t xml:space="preserve"> Intravascular lithotripsy (IVL) fractures coronary calcium before stenting, but which lesions fracture is hard to predict from imaging scores. We asked whether mechanics computed before treatment predict calcium fracture under IVL in </w:t>
+        <w:t xml:space="preserve"> Intravascular lithotripsy (IVL) fractures coronary calcium before stenting, but which lesions fracture is hard to predict from imaging scores. We asked whether stress computed before treatment anticipates calcium damage under IVL in </w:t>
       </w:r>
       <w:r>
         <w:rPr>
@@ -41,7 +41,7 @@
         <w:t>Methods:</w:t>
       </w:r>
       <w:r>
-        <w:t xml:space="preserve"> Calcified coronary cross-sections were generated as a designed core set (34 lesions: calcium arc, thickness and morphology) and a sampled hold-out set (0 lesions). Candidate predictors came from a linear-elastic analysis of the untreated lesion. The outcome, through-thickness calcium damage, came from a separate nonlinear finite element model with a phase-field fracture law under an equivalent IVL load. Thresholds and a composite index were derived on the core set and tested unchanged on the hold-out set, against the optical coherence tomography (OCT) calcium score of Fujino. </w:t>
+        <w:t xml:space="preserve"> Calcified coronary cross-sections formed a designed core set (34 lesions: calcium arc, thickness, morphology) and a sampled hold-out set (0 lesions). Candidate predictors came from a linear-elastic analysis of the untreated lesion; through-thickness calcium damage came from a separate nonlinear finite element model with a phase-field damage law under a quasi-static equivalent IVL load. Thresholds and a composite index were derived on the core set, tested unchanged on the hold-out set and compared with the optical coherence tomography (OCT) calcium score of Fujino. </w:t>
       </w:r>
       <w:r>
         <w:rPr>
@@ -50,7 +50,7 @@
         <w:t>Results:</w:t>
       </w:r>
       <w:r>
-        <w:t xml:space="preserve"> On the core set, the non-local peak \sigma_1 had an area under the receiver operating characteristic curve (AUC) of 0.96 (95% CI 0.89–1.00), and the Fujino score 0.62 (95% CI 0.43–0.78). The composite index LIFT had a leave-one-out AUC of 0.95 (95% CI 0.85–1.00). A geometry-only model reached 0.88, and adding mechanics gave 0.92 (not clearly different). On the hold-out set, the non-local peak \sigma_1 had an AUC of [pending] (95% CI [pending]–[pending]). The model reproduced the published association of fracture with calcium arc but not the clinical fracture rates. </w:t>
+        <w:t xml:space="preserve"> Damage was all or nothing. On the core set, the non-local peak \sigma_1 had an apparent area under the receiver operating characteristic curve (AUC) of 0.96 (95% CI 0.89–1.00), the cross-sectional Fujino score 0.62, or 0.89 with a measurement tolerance at its arc cut-off. Leave-one-out AUCs were 0.95 for the composite index LIFT, 0.88 for geometry alone and 0.92 with mechanics added (not clearly different). On the hold-out set, the non-local peak \sigma_1 had an AUC of [pending] (95% CI [pending]–[pending]). The model reproduced the published association of fracture with calcium arc; IVL acted as a static load below the plain-balloon pressure, and the plain balloon damaged lesions that did not fracture in cadaver arteries. </w:t>
       </w:r>
       <w:r>
         <w:rPr>
@@ -59,16 +59,7 @@
         <w:t>Conclusions:</w:t>
       </w:r>
       <w:r>
-        <w:t xml:space="preserve"> In this model, pre-treatment mechanics ranked lesions for calcium fracture under IVL better than the Fujino score, with no clear gain in discrimination over geometry alone. These are </w:t>
-      </w:r>
-      <w:r>
-        <w:rPr>
-          <w:i/>
-        </w:rPr>
-        <w:t>in silico</w:t>
-      </w:r>
-      <w:r>
-        <w:t xml:space="preserve"> results; they require comparison with OCT after IVL in patient lesions.</w:t>
+        <w:t xml:space="preserve"> In this model, linear stress in the untreated lesion anticipated nonlinear damage onset, partly by construction, but did not clearly outperform geometry or a tolerance-corrected Fujino score. The model reproduces no IVL-specific effect; comparison with OCT after IVL in patient lesions is required.</w:t>
       </w:r>
     </w:p>
     <w:p>
@@ -179,7 +170,7 @@
     </w:p>
     <w:p>
       <w:r>
-        <w:t>Every input of the two-dimensional (2D) main analysis is listed with its value, source and status in Table 1, except the sampling ranges of the hold-out set, which are given in Section 2.2. Inputs with status UNVERIFIED were not used. Most literature values were checked against text attributed to their source in search results rather than against the full primary article. Secondary-source inputs (the tissue densities of the transient model and the physiological pressure, decision D15) and one provisional input (the lipid modulus) were used and are flagged in Table 1. Decisions taken during the study are numbered D1–D15 and recorded in the configuration file.</w:t>
+        <w:t>Every input of the two-dimensional (2D) main analysis is listed with its value, source and status in Table 1, except the sampling ranges of the hold-out set, which are given in Section 2.2. Inputs with status UNVERIFIED were not used. Most literature values were checked against text attributed to their source in search results rather than against the full primary article. Secondary-source inputs (the tissue densities of the transient model, physiological lumen pressure and IVL pulse width) and one provisional input (the lipid modulus) were used; decision D15 approved the densities and the physiological pressure as exceptions, and all are flagged in Table 1. Decisions taken during the study are numbered D1–D15 and recorded in the configuration file.</w:t>
       </w:r>
     </w:p>
     <w:p>
@@ -190,7 +181,7 @@
         <w:t xml:space="preserve">Table 1. </w:t>
       </w:r>
       <w:r>
-        <w:t>Model inputs. Literature values with their status (VERIFIED: value confirmed in the cited source; SECONDARY: from a secondary source; DERIVED: computed from other inputs; DESIGN or ASSUMPTION: study choice), the range used in the sensitivity analysis, and the source or basis.</w:t>
+        <w:t>Model inputs with their status (VERIFIED, value seen in text attributed to the cited source in search results (the full primary article was not always read); SECONDARY, quoted from a later source; PROVISIONAL, verified value with an incomplete citation; CALIBRATED, set to a model target (decision D8); DERIVED, computed from other inputs; DESIGN, study choice; ASSUMPTION, study assumption; NUMERICAL, numerical setting), the alternative values listed for sensitivity analysis, and the source or basis. The analyses that were run are described in Section 2.9; not every listed alternative was run, and the lowest calcium modulus of the calibration sweep was not run (Section 2.4).</w:t>
       </w:r>
     </w:p>
     <w:tbl>
@@ -488,7 +479,7 @@
           </w:tcPr>
           <w:p>
             <w:r>
-              <w:t>0.848</w:t>
+              <w:t>0.848172</w:t>
             </w:r>
           </w:p>
         </w:tc>
@@ -1290,7 +1281,7 @@
           </w:tcPr>
           <w:p>
             <w:r>
-              <w:t>365</w:t>
+              <w:t>365.006</w:t>
             </w:r>
           </w:p>
         </w:tc>
@@ -1572,7 +1563,7 @@
           </w:tcPr>
           <w:p>
             <w:r>
-              <w:t>[56]</w:t>
+              <w:t>Rooney 1982</w:t>
             </w:r>
           </w:p>
         </w:tc>
@@ -1614,7 +1605,7 @@
           </w:tcPr>
           <w:p>
             <w:r>
-              <w:t>2.31</w:t>
+              <w:t>2.312</w:t>
             </w:r>
           </w:p>
         </w:tc>
@@ -1778,7 +1769,7 @@
           </w:tcPr>
           <w:p>
             <w:r>
-              <w:t>1080</w:t>
+              <w:t>1075</w:t>
             </w:r>
           </w:p>
         </w:tc>
@@ -1858,7 +1849,7 @@
           </w:tcPr>
           <w:p>
             <w:r>
-              <w:t>1580</w:t>
+              <w:t>1584</w:t>
             </w:r>
           </w:p>
         </w:tc>
@@ -2098,7 +2089,7 @@
           </w:tcPr>
           <w:p>
             <w:r>
-              <w:t>1530</w:t>
+              <w:t>1526</w:t>
             </w:r>
           </w:p>
         </w:tc>
@@ -2258,7 +2249,7 @@
           </w:tcPr>
           <w:p>
             <w:r>
-              <w:t>0.017</w:t>
+              <w:t>0.01701</w:t>
             </w:r>
           </w:p>
         </w:tc>
@@ -2338,7 +2329,7 @@
           </w:tcPr>
           <w:p>
             <w:r>
-              <w:t>−0.0734</w:t>
+              <w:t>−0.07342</w:t>
             </w:r>
           </w:p>
         </w:tc>
@@ -2418,7 +2409,7 @@
           </w:tcPr>
           <w:p>
             <w:r>
-              <w:t>0.415</w:t>
+              <w:t>0.41495</w:t>
             </w:r>
           </w:p>
         </w:tc>
@@ -2498,7 +2489,7 @@
           </w:tcPr>
           <w:p>
             <w:r>
-              <w:t>1080</w:t>
+              <w:t>1075</w:t>
             </w:r>
           </w:p>
         </w:tc>
@@ -2578,7 +2569,7 @@
           </w:tcPr>
           <w:p>
             <w:r>
-              <w:t>1610</w:t>
+              <w:t>1609</w:t>
             </w:r>
           </w:p>
         </w:tc>
@@ -2616,7 +2607,7 @@
           </w:tcPr>
           <w:p>
             <w:r>
-              <w:t>[55]</w:t>
+              <w:t>Rooney 1979</w:t>
             </w:r>
           </w:p>
         </w:tc>
@@ -2658,7 +2649,7 @@
           </w:tcPr>
           <w:p>
             <w:r>
-              <w:t>0.016</w:t>
+              <w:t>0.0159986</w:t>
             </w:r>
           </w:p>
         </w:tc>
@@ -2738,7 +2729,7 @@
           </w:tcPr>
           <w:p>
             <w:r>
-              <w:t>0.405</w:t>
+              <w:t>0.4053</w:t>
             </w:r>
           </w:p>
         </w:tc>
@@ -2818,7 +2809,7 @@
           </w:tcPr>
           <w:p>
             <w:r>
-              <w:t>1.01</w:t>
+              <w:t>1.01325</w:t>
             </w:r>
           </w:p>
         </w:tc>
@@ -3382,7 +3373,7 @@
           </w:tcPr>
           <w:p>
             <w:r>
-              <w:t>1.62</w:t>
+              <w:t>1.6212</w:t>
             </w:r>
           </w:p>
         </w:tc>
@@ -3624,7 +3615,7 @@
           </w:tcPr>
           <w:p>
             <w:r>
-              <w:t>6.07</w:t>
+              <w:t>6.06824</w:t>
             </w:r>
           </w:p>
         </w:tc>
@@ -4266,7 +4257,7 @@
           </w:tcPr>
           <w:p>
             <w:r>
-              <w:t>0.00549</w:t>
+              <w:t>0.00548959</w:t>
             </w:r>
           </w:p>
         </w:tc>
@@ -4426,7 +4417,7 @@
           </w:tcPr>
           <w:p>
             <w:r>
-              <w:t>0.073</w:t>
+              <w:t>0.0730012</w:t>
             </w:r>
           </w:p>
         </w:tc>
@@ -4506,7 +4497,7 @@
           </w:tcPr>
           <w:p>
             <w:r>
-              <w:t>7.3</w:t>
+              <w:t>7.30012</w:t>
             </w:r>
           </w:p>
         </w:tc>
@@ -4586,7 +4577,7 @@
           </w:tcPr>
           <w:p>
             <w:r>
-              <w:t>0.031</w:t>
+              <w:t>0.0309762</w:t>
             </w:r>
           </w:p>
         </w:tc>
@@ -5090,7 +5081,7 @@
     </w:p>
     <w:p>
       <w:r>
-        <w:t>The calcium modulus is the most uncertain input: published values range from 1.5 MPa for tissue-level tension [34] to the gigapascal range at the particle scale, reported from nanoindentation and summarised in a parametric FE study [35]. In the pilot phase, 9 log-spaced moduli between 1.47 MPa and 10 GPa were run on the three pilot lesions (whose geometries are core lesions, Section 2.2). The baseline was set to 365 MPa (decision D8), the stiffest swept modulus at which the IVL balloon inflated alone did not damage the pilot lesions while IVL did. This is a calibration to a criterion internal to the model, not to a measured property, and the outcome model's response on three core geometries thereby set the modulus that both models use. With the failure strain below, it implies a calcium failure stress of 7.3 MPa, about 41 times the tissue-level strength of 0.18 MPa measured in tension [36], and at this modulus a plain balloon at 10 atm still fractured part of the pilot lesions, unlike in cadaver lesions [50]. The modulus was therefore varied in the sensitivity analysis (Section 2.9).</w:t>
+        <w:t>The calcium modulus is the most uncertain input: published values range from 1.5 MPa for tissue-level tension [34] to the gigapascal range at the particle scale, reported from nanoindentation and summarised in a parametric FE study [35]. In the pilot phase, 9 log-spaced moduli between 1.47 MPa and 10 GPa were set for the three pilot lesions (whose geometries are core lesions, Section 2.2), together with the tissue-level secant modulus (8.95 MPa); the lowest modulus (1.47 MPa) was not run, because calcium softer in shear than the fibrous matrix leaves the crack filler undefined. The baseline was set to 365 MPa (decision D8), the stiffest swept modulus at which the IVL balloon inflated alone did not damage the pilot lesions while IVL did. This is a calibration to a criterion internal to the model, not to a measured property; because calcium failure is strain-controlled (below), it also set the calcium strength. The outcome model's response on three core geometries thereby set the modulus that both models use. With the failure strain below, it implies a calcium failure stress of 7.3 MPa, about 41 times the tissue-level strength of 0.18 MPa measured in tension [36], and at this modulus a plain balloon at 10 atm still fractured part of the pilot lesions, unlike in cadaver lesions [50]. The modulus was therefore varied in the sensitivity analysis (Section 2.9).</w:t>
       </w:r>
     </w:p>
     <w:p>
@@ -5108,7 +5099,7 @@
     </w:p>
     <w:p>
       <w:r>
-        <w:t>IVL was represented by its quasi-static equivalent (decision D14): the balloon was inflated inside the cap, the pressure was then raised in a quasi-static ramp to the peak p_{top} = p_{bal} + T_{eq}\,p_{peak}\,s, and the lesion was unloaded. Here p_{bal} is the balloon pressure, p_{peak} = 5 MPa the reported peak positive pressure of the pulse (measurement location not stated) [5], s = 1 a pulse-amplitude scale (varied in the sensitivity analysis) and T_{eq} a lesion-specific transfer factor from a linear elastodynamic analysis of one pulse. That analysis applied a half-sine lumen pressure pulse of 2 µs (the upper bound of the reported pulse duration [54]; pulse shape assumed) with an absorbing (Lysmer–Kuhlemeyer dashpot) outer boundary. The bulk moduli came from measured longitudinal sound speeds of arterial tissue [55], highly calcified lesions [56], fibrous plaque [57] and fatty material [58] (K = \rho c^2 - 4\mu/3), with densities from earlier modelling studies [59–61] (secondary sources, decision D15); time integration used the non-dissipative generalised-α scheme and a mixed displacement–pressure formulation. T_{eq} is the largest cell value of the maximum principal stress in the calcium during the pulse divided by the same quantity in a static linear-elastic solve with the constants of the predictor model under a lumen pressure equal to the pulse peak; in that linear model, the pulse-equivalent increment reproduces the transient peak. The equivalence represents the peak tensile response to one pulse; the compressive wavefront, repeated pulses and fatigue were not modelled.</w:t>
+        <w:t>IVL was represented by its quasi-static equivalent (decision D14): the balloon was inflated inside the cap, the pressure was then raised in a quasi-static ramp to the peak p_{top} = p_{bal} + T_{eq}\,p_{peak}\,s, and the lesion was unloaded. Here p_{bal} is the balloon pressure, p_{peak} = 5 MPa the reported peak positive pressure of the pulse (measurement location not stated) [5], s = 1 a pulse-amplitude scale (varied in the sensitivity analysis) and T_{eq} a lesion-specific transfer factor from a linear elastodynamic analysis of one pulse. That analysis applied a half-sine lumen pressure pulse of 2 µs (the upper bound of the reported pulse duration [54]; pulse shape assumed) with an absorbing (Lysmer–Kuhlemeyer dashpot) outer boundary. The bulk moduli came from measured longitudinal sound speeds of arterial tissue [55], highly calcified lesions [56], fibrous plaque [57] and fatty material [58] (K = \rho c^2 - 4\mu/3), with densities from earlier modelling studies [59–61] (secondary sources, decision D15); time integration used the non-dissipative generalised-α scheme and a mixed displacement–pressure formulation, with a time step of the smaller of the pulse width over 40 and the stability limit of the mesh. T_{eq} is the largest cell value of the maximum principal stress in the calcium over a window of 10 pulse widths from the start of the pulse (in the cohort the peak came 2.1–19 µs after the pulse start, after the end of the pulse in 34 of 34 lesions), divided by the same quantity in a static linear-elastic solve with the constants of the predictor model under a lumen pressure equal to the pulse peak; in that linear model, the pulse-equivalent increment reproduces the transient peak. The equivalence represents the peak tensile response to one pulse; the compressive wavefront, repeated pulses and fatigue were not modelled.</w:t>
       </w:r>
     </w:p>
     <w:p>
@@ -5139,7 +5130,7 @@
         <w:t>2 + k, and the fracture energy is \frac{3 G_c}{8}\int (d/\ell + \ell |\nabla d|</w:t>
       </w:r>
       <w:r>
-        <w:t>2)\,dx. The residual stiffness k was set so that fully damaged calcium keeps the shear stiffness of the surrounding fibrous matrix (decision D9; k = 0.0055), and G_c = 16\,\ell\,(1-k)\,\psi_{crit}/3 places the AT1 damage onset at the critical energy \psi_{crit} of a uniaxial failure strain \varepsilon_f (decision D5). The failure strain \varepsilon_f = 0.02 is the failure stretch of calcified tissue minus one, measured in uniaxial tension of human iliac plaques [36]. The regularisation length was \ell = 80 µm, 2 times the calcium element size. Each load increment was solved by alternate minimisation [26]: a Newton solve for the displacement with damage fixed, then a bound-constrained solve for the damage with displacement fixed, repeated until the largest damage change fell below 0.001 or 100 iterations were reached; increments that reached the iteration limit were counted and are reported.</w:t>
+        <w:t>2)\,dx. The residual stiffness k was set so that fully damaged calcium keeps the shear stiffness of the surrounding fibrous matrix (decision D9; k = 0.0055), and G_c = 16\,\ell\,(1-k)\,\psi_{crit}/3 places the AT1 damage onset at the critical energy \psi_{crit} of a uniaxial failure strain \varepsilon_f (decision D5). The failure strain \varepsilon_f = 0.02 is the failure stretch of calcified tissue minus one, measured in uniaxial tension of human iliac plaques [36]. Because \ell is tied to the element size (below), G_c is a numerical parameter rather than a measured toughness, and the model is in effect a strength-based damage-nucleation model. The regularisation length was \ell = 80 µm, 2 times the calcium element size. Each load increment was solved by alternate minimisation [26]: a Newton solve for the displacement with damage fixed, then a bound-constrained solve for the damage with displacement fixed, repeated until the largest damage change fell below 0.001 or 100 iterations were reached; increments that reached the iteration limit were counted and are reported.</w:t>
       </w:r>
     </w:p>
     <w:p>
@@ -5157,7 +5148,7 @@
     </w:p>
     <w:p>
       <w:r>
-        <w:t>Calcium was considered damaged where the cell-averaged damage exceeded 0.9. The damage-onset load of a protocol is the lumen pressure of the first load step at which the maximum damage reached this value. A damaged component that connects the luminal and abluminal calcium surfaces and cuts its deposit (splits it into pieces of at least 3 cells, opens a closed ring or removes it entirely) is a through-thickness fracture; other damaged components, including damage confined to a rounded deposit end, are partial. A component covering at least 50% of its deposit was labelled diffuse; it is still a through-thickness fracture when it meets that definition. Decision D10 named through-thickness damage and the damage-onset pressure as the primary fracture outcomes and the damaged fraction as secondary. In the statistical analysis (Section 2.10), through-thickness damage under IVL is the primary outcome; the secondary outcomes are the damage-onset load under IVL, through-thickness damage under the IVL balloon alone, under the plain balloon and under IVL with the erosion comparator, and stent expansion with and without prior IVL. Stent expansion is the stent area after recoil divided by the reference lumen area (the area of a circle of the reference vessel diameter), in per cent; because the stent was expanded at most to its target diameter, expansion before recoil cannot exceed 90.7%. Acute recoil is the relative loss of stent radius between deployment and recoil.</w:t>
+        <w:t>Calcium was considered damaged where the cell-averaged damage exceeded 0.9. The damage-onset load of a protocol is the lumen pressure of the first load step at which the largest nodal damage in the calcium reached this value (a local criterion that can precede any damaged cell); for the stent protocols the load is the stent radius. A damaged component that connects the luminal and abluminal calcium surfaces and cuts its deposit (splits it into pieces of at least 3 cells, opens a closed ring or removes it entirely) is a through-thickness fracture; other damaged components, including damage confined to a rounded deposit end, are partial. A component covering at least 50% of its deposit was labelled diffuse; it is still a through-thickness fracture when it meets that definition. Decision D10 named through-thickness damage and the damage-onset pressure as the primary fracture outcomes and the damaged fraction as secondary. In the statistical analysis (Section 2.10), through-thickness damage under IVL is the primary outcome; the secondary outcomes are the damage-onset load under IVL, through-thickness damage under the IVL balloon alone, under the plain balloon and under IVL with the erosion comparator, and stent expansion with and without prior IVL. Stent expansion is the stent area after recoil divided by the reference lumen area (the area of a circle of the reference vessel diameter), in per cent; because the stent was expanded at most to its target diameter, expansion before recoil cannot exceed 90.7%. Acute recoil is the relative loss of stent radius between deployment and recoil.</w:t>
       </w:r>
     </w:p>
     <w:p>
@@ -5170,7 +5161,7 @@
     </w:p>
     <w:p>
       <w:r>
-        <w:t>The predictor model is a small-strain, plane-strain linear-elastic solve of the undamaged lesion under a lumen pressure of 4 atm (0.405 MPa) (the IVL balloon pressure), with the material constants of Section 2.4 linearised at zero strain. From the calcium cells it gives the maximum principal stress \sigma_1 (including the out-of-plane stress), the maximum principal strain \varepsilon_1 and the strain energy density (SED). The predictors were the area-weighted 95th and 99th percentiles and mean of \sigma_1; the mean SED; non-local peaks of \sigma_1 and SED, in which each cell value is replaced by the area-weighted mean over the calcium within a radius equal to the phase-field length (80 µm) before the maximum is taken; the calcium area fractions with \varepsilon_1 above \varepsilon_f and \varepsilon_f/2 and with \sigma_1 above the failure stress and half of it; an edge stress concentration factor (the non-local peak \sigma_1 near deposit ends over the mean \sigma_1 of the calcium, within an angular window of at least 10° around each end); and the smallest local calcium thickness among the cells above the 90th percentile of \sigma_1. Raw cell peaks were not used as predictors because they changed by more than the acceptance limit under mesh refinement (Section 2.9).</w:t>
+        <w:t>The predictor model is a small-strain, plane-strain linear-elastic solve of the undamaged lesion under a lumen pressure of 4 atm (0.405 MPa) (the IVL balloon pressure), with the material constants of Section 2.4 linearised at zero strain. From the calcium cells it gives the maximum principal stress \sigma_1 (including the out-of-plane stress), the maximum principal strain \varepsilon_1 and the strain energy density (SED). The predictors were the area-weighted 95th and 99th percentiles and mean of \sigma_1; the mean SED; non-local peaks of \sigma_1 and SED, in which each cell value is replaced by the area-weighted mean over the calcium within a radius equal to the phase-field length (80 µm) before the maximum is taken; the calcium area fractions with \varepsilon_1 above \varepsilon_f and \varepsilon_f/2 and with \sigma_1 above the implied failure stress \sigma_{crit} = E_{Ca}\varepsilon_f of the outcome model and half of it; an edge stress concentration factor (the non-local peak \sigma_1 near deposit ends over the mean \sigma_1 of the calcium, within the larger of 10° and twice the deposit thickness over its mean radius on either side of each end, and set to one for a closed ring); and the smallest local calcium thickness among the cells above the 90th percentile of \sigma_1. Raw cell peaks were not used as predictors because they changed by more than the acceptance limit under mesh refinement (Section 2.9).</w:t>
       </w:r>
     </w:p>
     <w:p>
@@ -5211,7 +5202,7 @@
     </w:p>
     <w:p>
       <w:r>
-        <w:t>The expected direction of each association was stated before the analysis. A higher value was expected with damage for the stress, strain-energy, area-fraction and edge-concentration predictors, the calcium arc and the Fujino score; a lower value was expected for the minimum calcium thickness under high stress, the maximum calcium thickness and minimum calcium depth. No direction was stated for the calcium area, number of deposits, lumen area, lipid arc and plaque eccentricity index. For these, the direction was set on the core set as the sign that gives an AUC of at least one half. It was re-derived inside each leave-one-out fold and kept fixed in the bootstrap, and it is flagged in the results as set on the core set, which makes these AUCs optimistic.</w:t>
+        <w:t>The expected direction of each association was fixed in the configuration before the final analysis, at a time when preliminary core outcomes already existed. A higher value was expected with damage for the stress, strain-energy, area-fraction and edge-concentration predictors, the calcium arc and the Fujino score; a lower value was expected for the minimum calcium thickness under high stress, the maximum calcium thickness and minimum calcium depth. No direction was stated for the calcium area, number of deposits, lumen area, lipid arc and plaque eccentricity index. For these, the direction was set on the core set as the sign that gives an AUC of at least one half. It was re-derived inside each leave-one-out fold and kept fixed in the bootstrap, and it is flagged in the results as set on the core set, which makes these AUCs optimistic.</w:t>
       </w:r>
     </w:p>
     <w:p>
@@ -5231,7 +5222,12 @@
     </w:p>
     <w:p>
       <w:r>
-        <w:t>The composite index and the best single mechanics predictor were compared with the Fujino score by the paired bootstrap of the AUC difference. The incremental value of mechanics over geometry was tested by comparing a geometry-only penalised logistic model with the same model plus the mechanics predictors chosen by the composite rule. The geometry-only model used the 4 descriptors that represent the core design factors (calcium arc, maximum calcium thickness, minimum calcium depth and number of deposits; the last two summarise the morphology). The two models were compared by the apparent AUC difference, with both models reselected and refitted in every bootstrap resample, by the LOOCV AUC, log-loss and Brier score (paired bootstrap of the out-of-fold predictions), and on the hold-out set with the core-fit models evaluated unchanged. A difference whose interval includes zero is reported as no evidence of incremental value.</w:t>
+        <w:t>The best single mechanics predictor was the one with the largest core AUC; it was chosen on the core set, and its intervals and AUC differences do not include this selection. The composite index and the best single mechanics predictor were compared with the Fujino score by the paired bootstrap of the AUC difference. The incremental value of mechanics over geometry was tested by comparing a geometry-only penalised logistic model with the same model plus the mechanics predictors chosen by the composite rule. The geometry-only model used the 4 descriptors that represent the core design factors (calcium arc, maximum calcium thickness, minimum calcium depth and number of deposits; the last two summarise the morphology). The two models were compared by the apparent AUC difference, with both models reselected and refitted in every bootstrap resample, by the LOOCV AUC, log-loss and Brier score (paired bootstrap of the out-of-fold predictions), and on the hold-out set with the core-fit models evaluated unchanged. A difference whose interval includes zero is reported as no evidence of incremental value. All core lesions share one reference geometry and one set of material constants, so on the core set the mechanics predictors are functions of the design factors and this comparison contrasts model forms; only the hold-out set, in which lumen area, eccentricity and lipid vary, can show added information.</w:t>
+      </w:r>
+    </w:p>
+    <w:p>
+      <w:r>
+        <w:t>Two analyses were added after the first draft and are reported as post hoc. The label map measures the arc of the middle design level just below the strict arc cut-off of the Fujino score, so the Fujino comparison was repeated with an arc within 2° below the cut-off counted as meeting it. The core AUCs were also recomputed without the core lesions that share the geometry of the pilot lesions used to calibrate the calcium modulus.</w:t>
       </w:r>
     </w:p>
     <w:p>
@@ -5781,7 +5777,7 @@
     </w:p>
     <w:p>
       <w:r>
-        <w:t>The core set comprised 34 lesions and the hold-out set 0. Runs that did not complete: the plain balloon (2 not run); IVL (2 not run); stenting without IVL (4 not run); stenting after IVL (2 not run). In 10 of 32 completed IVL runs of the core set, at least one load step was accepted after the staggered iteration reached its iteration limit (Section 2.6). No stent run of the core set was pressure-limited.</w:t>
+        <w:t>The core set comprised 34 lesions and the hold-out set 0. Runs that did not complete: the plain balloon (2 not run); IVL (2 not run); stenting without IVL (4 not run); stenting after IVL (2 not run). In 10 of 16 completed IVL runs of the core set with through-thickness damage and in 0 of 16 without it, at least one load step was accepted after the staggered iteration reached its iteration limit (Section 2.6). No stent run of the core set was pressure-limited.</w:t>
       </w:r>
     </w:p>
     <w:p>
@@ -5791,17 +5787,22 @@
     </w:p>
     <w:p>
       <w:r>
-        <w:t>Under IVL, through-thickness damage occurred in 2 of 12 at 90°, 9 of 12 at 180° and 5 of 8 at 270° of arc. By thickness it occurred in 7 of 12 at 0.2 mm, 6 of 12 at 0.4 mm and 3 of 8 at 0.8 mm, and by morphology in 6 of 8 superficial sheets, 5 of 8 deep sheets, 5 of 8 nodules and 0 of 8 fragmented deposits.</w:t>
+        <w:t>In the nonlinear model, IVL acted as a quasi-static inflation to the peak equivalent pressure, which ranged from 0.51 to 0.96 MPa and was below the plain-balloon pressure in 32 of 32 lesions. Of the 16 lesions damaged under IVL, 16 were also damaged under the plain balloon, which damaged 1 further lesion; in this model the two protocols therefore differed only in load magnitude. The lesions did not resist dilation: under the IVL balloon pressure alone, the lumen area grew from 2.2 mm² to 2.7–6.0 mm².</w:t>
       </w:r>
     </w:p>
     <w:p>
       <w:r>
-        <w:t>The phase-field damage was mostly spread over the deposit rather than concentrated in discrete cracks: in 16 of 16 core lesions with through-thickness damage under IVL, damage covered at least half of the damaged calcium region (the diffuse pattern of Section 2.7; Figure 4a). The element-erosion comparator, run on 4 lesions, gave through-thickness cracks in 4 of them, as discrete cracks (median 2.5 per lesion; Figure 4b). The damage after stenting is shown in Figure 4c.</w:t>
+        <w:t>Under IVL, through-thickness damage occurred in 2 of 12 at 90°, 9 of 12 at 180° and 5 of 8 at 270° of arc. By thickness it occurred in 7 of 12 at 0.2 mm, 6 of 12 at 0.4 mm and 3 of 8 at 0.8 mm, and by morphology in 6 of 8 superficial sheets, 5 of 8 deep sheets, 5 of 8 nodules and 0 of 8 fragmented deposits.</w:t>
       </w:r>
     </w:p>
     <w:p>
       <w:r>
-        <w:t>In the 30 core lesions with both stent runs, the median stent expansion was 82.2% (interquartile range 81.2–83.1%) without IVL and 82.4% (81.2–83.1%) after IVL. The paired difference had a median of 0.0 percentage points (Figure 5b). Of the 14 of these lesions with through-thickness damage under IVL, 12 also had it under stenting without IVL. Across the core stent runs, the expansion ranged from 79.1% to 83.4%.</w:t>
+        <w:t>The phase-field outcome was all or nothing. In 16 of 16 core lesions with through-thickness damage under IVL, the damage covered the whole calcium (the smallest damaged fraction was 100%), and in 16 of 16 lesions without it no calcium cell was damaged (Figure 4a). Through-thickness damage was therefore equivalent to damage onset before the peak IVL load. The element-erosion comparator, run on 4 lesions, gave through-thickness cracks in 4 of them, as discrete cracks (median 2.5 per lesion; Figure 4b). The damage after stenting is shown in Figure 4c.</w:t>
+      </w:r>
+    </w:p>
+    <w:p>
+      <w:r>
+        <w:t>In the 30 core lesions with both stent runs, the median stent expansion was 82.2% (interquartile range 81.2–83.1%) without IVL and 82.4% (81.2–83.1%) after IVL. The paired difference had a median of 0.0 percentage points (Figure 5b). Of the 14 of these lesions with through-thickness damage under IVL, 12 also had it under stenting without IVL. Across the core stent runs, the expansion ranged from 79.1% to 83.4%. Every stent reached its target diameter, so the expansion differed between lesions only through the elastic recoil after unloading.</w:t>
       </w:r>
     </w:p>
     <w:p>
@@ -5848,7 +5849,7 @@
         <w:t xml:space="preserve">Figure 4. </w:t>
       </w:r>
       <w:r>
-        <w:t>Calcium damage fields of one lesion per morphology with the same arc and thickness. (a) IVL with the phase field: damage. (b) IVL with the element-erosion comparator: eroded calcium cells. (c) Stent deployed after IVL: damage, with the lumen outline after stenting and the reference lumen. Deformed configuration, final state of each run.</w:t>
+        <w:t>Calcium damage fields of one lesion per morphology with the same arc and thickness. (a) IVL with the phase field: damage. (b) IVL with the element-erosion comparator: eroded calcium cells; the deep sheets and fragmented deposits runs were made for this figure only and are outside the comparator subset. (c) Stent deployed after IVL: damage, with the lumen outline after stenting and the reference lumen. Deformed configuration, final state of each run.</w:t>
       </w:r>
     </w:p>
     <w:p>
@@ -5918,12 +5919,22 @@
     </w:p>
     <w:p>
       <w:r>
-        <w:t>The rule of Section 2.10 selected the non-local peak \sigma_1, the mean \sigma_1 and the edge stress concentration factor for LIFT (Table 4). These predictors were selected in every leave-one-out fold. No selected predictor had a coefficient opposite to its stated direction. LIFT had an apparent AUC of 0.99 and a leave-one-out AUC of 0.95 (95% CI 0.85–1.00), with a leave-one-out log-loss of 0.284 and Brier score of 0.081. Its leave-one-out AUC was not different from that of the non-local peak \sigma_1 (difference −0.01; 95% CI −0.06 to 0.02).</w:t>
+        <w:t>The rule of Section 2.10 selected the non-local peak \sigma_1, the mean \sigma_1 and the edge stress concentration factor for LIFT (Table 4). These predictors were selected in every leave-one-out fold. No selected predictor had a coefficient opposite to its stated direction. LIFT had an apparent AUC of 0.99 and a leave-one-out AUC of 0.95 (95% CI 0.85–1.00), with a leave-one-out log-loss of 0.284 and Brier score of 0.081. Its leave-one-out AUC was not clearly different from that of the non-local peak \sigma_1 (difference −0.01; 95% CI −0.06 to 0.02).</w:t>
       </w:r>
     </w:p>
     <w:p>
       <w:r>
-        <w:t>Compared with the Fujino score, the AUC of the non-local peak \sigma_1 was higher (difference 0.35; 95% CI 0.18–0.54), and so was the leave-one-out AUC of LIFT (difference 0.34; 95% CI 0.18–0.52). The geometry-only model had a leave-one-out AUC of 0.88, and adding the selected mechanics predictors gave 0.92 (difference 0.04; 95% CI −0.01 to 0.12; Figure 6d). The apparent difference with both models refitted in every resample was 0.04 (95% CI 0.00–0.14). The interval of the AUC difference includes zero, so the AUC gives no evidence of incremental value; whereas the out-of-fold log-loss and Brier score were lower with mechanics (log-loss difference −0.115; 95% CI −0.179 to −0.052; Brier score difference −0.034; 95% CI −0.059 to −0.009).</w:t>
+        <w:t>Compared with the Fujino score, the AUC of the non-local peak \sigma_1 was higher (difference 0.35; 95% CI 0.18–0.54), and the leave-one-out AUC of LIFT was higher (difference 0.34; 95% CI 0.18–0.52). The geometry-only model had a leave-one-out AUC of 0.88, and adding the selected mechanics predictors gave 0.92 (difference 0.04; 95% CI −0.01 to 0.12; Figure 6d). The apparent difference with both models refitted in every resample was 0.04 (95% CI 0.00–0.14). The interval of the AUC difference includes zero, so the AUC gives no evidence of incremental value; whereas the out-of-fold log-loss and Brier score were lower with mechanics (log-loss difference −0.115; 95% CI −0.179 to −0.052; Brier score difference −0.034; 95% CI −0.059 to −0.009).</w:t>
+      </w:r>
+    </w:p>
+    <w:p>
+      <w:r>
+        <w:t>The arc criterion of the Fujino score awards points above 180°. The 9 core lesions of the 180° design level measured just below it on the label map and received no arc points; 9 of 9 were damaged under IVL. In a post hoc sensitivity analysis added after the first draft, an arc within 2° below the cut-off was counted as meeting it. The Fujino score then had an AUC of 0.89 (95% CI 0.76–1.00), and its difference from the non-local peak \sigma_1 was 0.07 (95% CI −0.04 to 0.21); the advantage of the mechanics predictor over the Fujino score therefore depends on where the design levels fall relative to the score's cut-offs.</w:t>
+      </w:r>
+    </w:p>
+    <w:p>
+      <w:r>
+        <w:t>The non-local peak \sigma_1 had the largest core AUC of the 11 mechanics candidates and was selected on the same core lesions; its intervals and its differences from other scores do not include this selection and are therefore optimistic. The minimum calcium thickness under high stress (AUC 0.26; 95% CI 0.11–0.46) was associated with damage in the direction opposite to the one stated before the analysis. Without the 2 core lesions that share the geometry of the pilot lesions used to calibrate the calcium modulus (post hoc), the AUC of the non-local peak \sigma_1 was 0.96 (95% CI 0.89–1.00) and that of the Fujino score 0.61 (95% CI 0.41–0.79).</w:t>
       </w:r>
     </w:p>
     <w:p>
@@ -8905,22 +8916,22 @@
     </w:p>
     <w:p>
       <w:r>
-        <w:t>Of the checks against published observations and model-internal criteria on the core set (Table 2), 4 agreed, 3 agreed partially, 3 disagreed and 1 could not be computed. The checks that agreed were C1, C6, C7 and C8; partial agreement (point estimate on the expected side, interval including the null value) was found for C2, C3 and C10; and C4, C5 and C11 disagreed.</w:t>
+        <w:t>Of the 8 comparisons with published observations on the core set (Table 2), 2 agreed (C1 and C7), 3 were inconclusive (point estimate on the expected side, interval including no effect, or only one of two criteria met) (C2, C3 and C10) and 3 disagreed (C4, C5 and C11). The model-internal criterion (C6) agreed, as expected by construction. The calibration target (C8) agreed, as expected by construction. The comparison with an earlier model (C9) could not be computed.</w:t>
       </w:r>
     </w:p>
     <w:p>
       <w:r>
-        <w:t>The proportion of core lesions with through-thickness damage under IVL was 50.0% (95% CI 33.6–66.4%), below the lesion-level fracture rates of 67.4% and 78.7% seen by OCT in the Disrupt CAD III and II studies [8,9] (check C4). The core set is a designed factorial, not a clinical case mix, so this proportion follows from the design. The plain balloon produced through-thickness damage in 53.1% (95% CI 36.4–69.1%) of core lesions, whereas no lesion fractured under a plain balloon in human cadaver coronary arteries examined by histology [50] (check C5). This disagreement follows from the calibration of the calcium modulus (decision D8), which was chosen so that the IVL balloon alone does not fracture calcium, at a lower pressure than the plain balloon.</w:t>
+        <w:t>The proportion of core lesions with through-thickness damage under IVL was 50.0% (95% CI 33.6–66.4%), below the lesion-level fracture rates of 67.4% and 78.7% seen by OCT in the Disrupt CAD III and II studies [8,9] (check C4). The core set is a designed factorial, not a clinical case mix, so this proportion follows from the design. The plain balloon produced through-thickness damage in 53.1% (95% CI 36.4–69.1%) of core lesions, whereas no lesion fractured under a plain balloon in human cadaver coronary arteries examined by histology [50] (check C5). In the model the plain balloon is a larger static load than the equivalent IVL load (Section 3.2), so this disagreement follows from the quasi-static representation of IVL (decision D14) together with the calcium modulus calibrated so that the IVL balloon alone does not fracture calcium (decision D8).</w:t>
       </w:r>
     </w:p>
     <w:p>
       <w:r>
-        <w:t>The mean stent expansion after IVL (82.1%, range 79.1–83.4%) lay within one standard deviation of the expansion reported at the site of maximum calcium (101.7%) and at the minimum stent area (78.4%) in Disrupt CAD III [9] (check C7). Its spread was much narrower than the clinical one (standard deviation 1.2 versus 28.9 percentage points).</w:t>
+        <w:t>The mean stent expansion after IVL (82.1%, range 79.1–83.4%) lay within one standard deviation of the expansion reported at the site of maximum calcium (101.7%) and at the minimum stent area (78.4%) in Disrupt CAD III [9] (check C7). Its spread was much narrower than the clinical one (standard deviation 1.2 versus 28.9 percentage points). Because every stent was expanded to its target diameter, this agreement mainly reflects the stent model and the wide clinical spread.</w:t>
       </w:r>
     </w:p>
     <w:p>
       <w:r>
-        <w:t>Under IVL, every fractured core lesion had a single through-thickness damage region, and 100% of the damage regions were full thickness, whereas a pooled OCT analysis of the Disrupt CAD studies reported a mean of 3.1 fractures per lesion, 72% of them full thickness [10] (check C10, partial agreement). The phase field spreads damage over the deposit, so it does not resolve separate cracks (Section 3.2).</w:t>
+        <w:t>Under IVL, every fractured core lesion had a single through-thickness damage region, and 100% of the damage regions were full thickness, whereas a pooled OCT analysis of the Disrupt CAD studies reported a mean of 3.1 fractures per lesion, 72% of them full thickness [10] (check C10, one of its two criteria met). The phase field spreads damage over the deposit, so it does not resolve separate cracks (Section 3.2).</w:t>
       </w:r>
     </w:p>
     <w:p>
@@ -8930,7 +8941,7 @@
     </w:p>
     <w:p>
       <w:r>
-        <w:t>The IVL balloon inflated without pulses produced no through-thickness damage in any core lesion (check C6). This model-internal criterion was used for the calibration on the pilot lesions, three of which share the geometry of core lesions, so it is not independent of the calibration.</w:t>
+        <w:t>The IVL balloon inflated without pulses produced no through-thickness damage in any core lesion (check C6). This model-internal criterion set the calcium modulus on the three pilot lesions, all of which share the geometry of core lesions, so it is not independent of the calibration.</w:t>
       </w:r>
     </w:p>
     <w:p>
@@ -9906,7 +9917,38 @@
     </w:p>
     <w:p>
       <w:r>
-        <w:t>[pending] One-at-a-time, Morris and Sobol results; three-dimensional length series.</w:t>
+        <w:t>In the pilot sweep of the calcium modulus (Section 2.4), only 365 MPa gave through-thickness damage under IVL in all 3 pilot lesions without damage under the IVL balloon alone. At the next lower modulus (121.1 MPa) the balloon alone damaged 1 of 3 lesions; at the next higher modulus (1100 MPa) IVL damaged 0 of 3. The fracture outcome of the model is therefore sensitive to the calcium modulus, and the calibrated value lies in a narrow window of the sweep.</w:t>
+      </w:r>
+    </w:p>
+    <w:p>
+      <w:r>
+        <w:t>[pending] (results/sensitivity_oat.json)</w:t>
+      </w:r>
+    </w:p>
+    <w:p>
+      <w:r>
+        <w:t>[pending] (results/sensitivity_morris.json)</w:t>
+      </w:r>
+    </w:p>
+    <w:p>
+      <w:r>
+        <w:t>[pending] (results/sensitivity_sobol.json)</w:t>
+      </w:r>
+    </w:p>
+    <w:p>
+      <w:r>
+        <w:t>[pending] (three-dimensional length series)</w:t>
+      </w:r>
+    </w:p>
+    <w:p>
+      <w:r>
+        <w:rPr>
+          <w:b/>
+        </w:rPr>
+        <w:t xml:space="preserve">Figure 7. </w:t>
+      </w:r>
+      <w:r>
+        <w:t>Sensitivity and uncertainty. (a) One-at-a-time scenarios on the pilot lesions: change of the IVL damage-onset load from each lesion's baseline run (open marker: onset censored in either run; ring: damage outcome changed). (b, c) Morris screening pooled over the screening lesions: \mu^* of the IVL damage-onset load and of IVL through-thickness damage, with bootstrap intervals. (d) Total-order (filled) and first-order (open) Sobol indices of the best single mechanics predictor per lesion. (e) Damage-onset load of the 3D models relative to the 2D model against model length.</w:t>
       </w:r>
     </w:p>
     <w:p>
@@ -9919,7 +9961,7 @@
     </w:p>
     <w:p>
       <w:r>
-        <w:t xml:space="preserve">In a structured </w:t>
+        <w:t xml:space="preserve">In a designed </w:t>
       </w:r>
       <w:r>
         <w:rPr>
@@ -9928,47 +9970,47 @@
         <w:t>in silico</w:t>
       </w:r>
       <w:r>
-        <w:t xml:space="preserve"> cohort of calcified coronary cross-sections, mechanics predictors computed from a linear-elastic analysis of the untreated lesion discriminated through-thickness calcium damage under IVL, which was computed by a separate nonlinear phase-field model. The best single predictor, the non-local peak \sigma_1, reached a core-set AUC of 0.96 and discriminated better than the cross-sectional Fujino score (AUC 0.62). The composite index LIFT did not improve on the best single predictor. Geometry alone already carried much of the information: the calcium arc was the strongest geometric descriptor, and the geometry-only model reached a leave-one-out AUC of 0.88. Adding mechanics did not clearly change the leave-one-out AUC, but it lowered the out-of-fold log-loss and Brier score, so its gain lay in calibrated probabilities more than in ranking. The hold-out evaluation (Section 3.3) tests the core thresholds and models on lesions outside the core design.</w:t>
+        <w:t xml:space="preserve"> cohort of calcified coronary cross-sections, a stress measure from a linear-elastic analysis of the untreated lesion, the non-local peak \sigma_1, ranked lesions for through-thickness calcium damage in a separate nonlinear phase-field model with a core-set AUC of 0.96. The composite index LIFT did not clearly improve on this single predictor. Three features of the model qualify the result. First, the damage outcome was all or nothing, so it amounts to damage onset before the peak load. The predictor averages the maximum principal stress over a radius equal to the phase-field length, the length that governs damage nucleation in the AT1 model, and the area-fraction predictors use the outcome model's own failure strain and stress. A high AUC is therefore partly expected by construction: it measures how well the linear stress state of the untreated lesion anticipates nonlinear damage onset in the same model, not clinical accuracy. Second, all core lesions share one reference geometry and one set of material constants, so every mechanics predictor is a deterministic function of the three design factors. On the core set the comparison with the geometry-only model compares model forms, not information content: adding mechanics did not clearly change the leave-one-out AUC and lowered the out-of-fold log-loss and Brier score, at a fixed penalty. Only the hold-out set, in which lumen area, eccentricity and lipid vary, can show added information. Third, the advantage over the Fujino score depended on the 180° design level measuring just below the score's arc cut-off; with a measurement tolerance at the cut-off the two scores did not differ clearly (Section 3.3).</w:t>
       </w:r>
     </w:p>
     <w:p>
       <w:r>
-        <w:t>The Fujino score was built to predict stent underexpansion, and it awards points for a large calcium arc, a thick deposit and a long lesion [2]. For fracture, these factors do not act in the same direction. After plain balloon angioplasty, fracture was associated with a large arc and thin calcium [3]. The model reproduced the arc association (check C1) and partly reproduced the thickness association (check C2). A thick deposit adds to the Fujino score, but in a thick-walled calcium shell the same lumen pressure produces lower stress. A predictor that combines arc, thickness and depth through the stress field can therefore rank lesions for fracture differently from a score that adds them. The non-local stress measures used here were also less sensitive to the mesh than raw cell peaks (Section 3.1), which matters when a single peak value is used as a threshold.</w:t>
+        <w:t>The Fujino score was built to predict stent underexpansion and awards points for a large calcium arc, a thick deposit and a long lesion [2]; a single cross-section cannot meet the length criterion. After plain balloon angioplasty, fracture was associated with a large arc and thin calcium [3]. The model reproduced the arc association (check C1) and gave an inconclusive result for the thickness association (check C2); the minimum calcium thickness under high stress was associated with damage opposite to its stated direction (Section 3.3). In this model the calcium arc (AUC 0.88) discriminated damage better than the maximum calcium thickness (AUC 0.54).</w:t>
       </w:r>
     </w:p>
     <w:p>
       <w:r>
-        <w:t>Clinical OCT studies report fewer calcium fractures after IVL in calcified nodules than in other calcium [11,12]. The model partly reproduced this (check C3). Fragmented deposits had no through-thickness damage in any of the 8 core lesions. Separate small deposits do not form a continuous arc that carries hoop stress, so the model predicts that they are unlikely to crack through. The model has no clinical counterpart for this result, and it should be tested with OCT.</w:t>
+        <w:t>Clinical OCT studies report fewer calcium fractures after IVL in calcified nodules than in other calcium [11,12]; the model gave an inconclusive result for this (check C3). Fragmented deposits had no through-thickness damage in any of the 8 core lesions; separate small deposits do not form a continuous arc that carries hoop load. This result has no clinical counterpart and should be tested with OCT.</w:t>
       </w:r>
     </w:p>
     <w:p>
       <w:r>
-        <w:t>The absolute fracture rates of the model should not be compared with clinical rates. The core set is a designed factorial, not a case mix (check C4). More importantly, the calcium modulus was calibrated so that the IVL balloon inflated alone does not fracture calcium (decision D8). With this calibration the plain balloon at its higher pressure produced through-thickness damage in 53% of the core lesions, whereas no lesion fractured under a plain balloon in a human cadaver study [50] (check C5). The model's static fracture load therefore lies between the two balloon pressures, lower than the cadaver data suggest. Because IVL entered the outcome model as an equivalent static pressure, the same bias may affect IVL. The predictors were scored on the ranking of lesions, which is less sensitive to such a shift than absolute rates. The sensitivity analysis to the calcium modulus (Section 3.6) quantifies this dependence.</w:t>
+        <w:t>The representation of IVL and the calibration limit what the model can say about lithotripsy. In the nonlinear model, IVL is a quasi-static inflation to a lesion-specific equivalent pressure (decision D14), which was below the plain-balloon pressure in every lesion, and every lesion damaged under IVL was also damaged under the plain balloon. The model therefore reproduces no effect specific to lithotripsy, and the plain balloon damaged lesions that did not fracture in cadaver arteries [50] (check C5). Because calcium failure is strain-controlled, the calibration of the calcium modulus (decision D8) also set the calcium strength: the implied failure stress was 7.3 MPa, against a measured calcification fracture stress of 0.179 MPa [36], and the modulus window that met the calibration criterion was a single point of the pilot sweep (Section 3.6). The ranking of lesions may be less sensitive to these choices than the absolute fracture rates; the one-at-a-time and Morris analyses test this only on a few lesions.</w:t>
       </w:r>
     </w:p>
     <w:p>
       <w:r>
-        <w:t>Stent expansion varied little between lesions and was nearly the same with and without prior IVL (Section 3.2). In the model, stenting alone produced through-thickness damage in 12 of 14 lesions that IVL fractured, and the stent was represented as a rigid cylinder expanded towards a target diameter. The model therefore cannot show a benefit of IVL on expansion, and the narrow spread of expansion (check C7) shows that the stent model does not reproduce the variability seen in patients. The exploratory stent analyses are reported for completeness and should not be read as clinical predictions.</w:t>
+        <w:t>The model lesions did not resist dilation: under the IVL balloon pressure alone the lumen area grew substantially (Section 3.2), and the hyperelastic soft tissue recovers on unloading, so fracture cannot produce a lasting lumen gain. In plane strain, an open calcium arc in soft tissue does not constrain dilation, so the model does not represent calcium-limited expansion, the premise of lesion preparation. The stent is a rigid cylinder expanded to a target diameter; the expansion therefore differed between lesions only through elastic recoil, its spread was far narrower than the clinical one (check C7), and the exploratory stent analyses should not be read as clinical predictions.</w:t>
       </w:r>
     </w:p>
     <w:p>
       <w:r>
-        <w:t>The phase field spread damage over most of the deposit, whereas the element-erosion comparator produced discrete cracks. The phase-field outcome is a statement about through-thickness loss of load-bearing capacity, not about the number or position of cracks, so the fracture counts of OCT studies (check C10) cannot be compared with it [10]. The width of a phase-field damage band scales with the regularisation length, and the thinnest calcium of the core set was only 2.5 such lengths thick, so a single band can span the deposit.</w:t>
+        <w:t>The phase field damaged the whole deposit rather than forming discrete cracks, whereas the element-erosion comparator produced discrete cracks. In the diagnostic runs made before the cohort, whole-deposit damage persisted with the phase-field length reduced to 20 µm, with a seeded initial crack and heterogeneous toughness, so its cause is not the ratio of the regularisation length to the deposit thickness and was not identified. Because the fracture toughness follows from the phase-field length, which is tied to the mesh size, the outcome model is in effect a strength-based damage-nucleation model; the number and position of cracks cannot be compared with OCT fracture counts (check C10) [10].</w:t>
       </w:r>
     </w:p>
     <w:p>
       <w:r>
-        <w:t>Predictors and outcomes were computed with separate models (Section 2.1): the predictors from a linear-elastic analysis of the undamaged lesion under the IVL balloon pressure, and the outcomes from a nonlinear phase-field analysis under the equivalent IVL load. Both models share the lesion geometry and the calcium constants, so this separation lies in the physics and the load, not in the inputs. A stress predictor that summarises the same geometry and constants is expected to discriminate well within the model. The AUCs therefore measure how much of the nonlinear outcome is already contained in the linear stress state of the untreated lesion; they are not estimates of clinical accuracy. Scoring the same predictors against the erosion comparator, a different fracture model, is a partial check (Section 3.4).</w:t>
+        <w:t>Predictors and outcomes came from separate models (Section 2.1): a linear-elastic analysis of the undamaged lesion under the IVL balloon pressure, and a nonlinear phase-field analysis under the equivalent IVL load. Both share the lesion geometry, all material constants and the calcium failure parameters, and the calcium modulus was calibrated by running the outcome model on three core geometries. The separation therefore lies in the physics and the load, not in the inputs. The planned cross-model check against the erosion comparator could not be made, because every lesion of its subset fractured (Section 3.4); it would in any case test only the damage law, because the comparator shares the geometry, the constants, the load and the failure strain.</w:t>
       </w:r>
     </w:p>
     <w:p>
       <w:r>
-        <w:t>This study has further limitations. No patient outcome data exist for these lesions; the evidence is verification, consistency with published observations, and sensitivity analysis. The lesions are idealised two-dimensional plane-strain cross-sections; the three-dimensional length series covers one cross-section only. IVL was represented by a quasi-static equivalent load from a linear transient analysis of one pulse with an assumed shape; pulse number, fatigue and cavitation were not modelled. The calcium properties are uncertain over a wide range, and the failure criterion rests on few tissue-level data. In 10 of 32 core IVL runs, at least one load step was accepted with an unconverged staggered iteration. The non-local peak SED changed under mesh refinement by slightly more than the acceptance limit. The core set is small, so apparent AUCs are optimistic; the leave-one-out and hold-out estimates are the relevant ones. Directions of some geometric descriptors were set on the core set, and the composite rule was drafted after a test run on preliminary core results.</w:t>
+        <w:t>Further limitations follow. No patient outcome data exist for these lesions; the evidence consists of verification, consistency with published observations and sensitivity analysis. The lesions are idealised two-dimensional plane-strain cross-sections, and the three-dimensional length series covers one cross-section. The transfer factor of the IVL load comes from a linear transient analysis of one pulse of assumed shape; its solver was checked by unit tests, and its discretisation error on the cohort meshes was not estimated. The phase-field outcome was not checked under mesh refinement, and the mesh study of the predictors covered 7 of the 12 mechanics candidates, with the non-local peak SED slightly above the acceptance limit. In 10 of 16 IVL runs with through-thickness damage, and in 0 of 16 without it, at least one load step was accepted with an unconverged staggered iteration. The core set is a fixed factorial: its bootstrap intervals describe resampling of design points, leave-one-out cross-validation keeps each lesion's near neighbours in the training set, and the best predictor was chosen on the same lesions. The candidate list, the a priori directions and the composite rule were fixed when preliminary core outcomes already existed, and the analyses marked post hoc were added after the first draft.</w:t>
       </w:r>
     </w:p>
     <w:p>
       <w:r>
-        <w:t>The next steps are lesions built from patient OCT images with segmentation-to-mesh pipelines [29–31], comparison of the predicted fracture with OCT after IVL in the same lesions, three-dimensional models over the lesion length, and a deformable stent model. Only such a comparison can show whether the pre-treatment mechanics predictors identified here carry information for patients.</w:t>
+        <w:t>The next steps are lesions built from patient OCT images with segmentation-to-mesh pipelines [29–31], a representation of IVL that distinguishes the pulse from a static inflation, a damage model whose outcome does not depend on the phase-field length alone, a deformable stent, and three-dimensional lesions. Only a comparison of the predicted fracture with OCT after IVL in the same lesions can show whether pre-treatment mechanics carry information for patients.</w:t>
       </w:r>
     </w:p>
     <w:p>
@@ -9981,7 +10023,7 @@
     </w:p>
     <w:p>
       <w:r>
-        <w:t xml:space="preserve">In a structured </w:t>
+        <w:t xml:space="preserve">In a designed </w:t>
       </w:r>
       <w:r>
         <w:rPr>
@@ -9990,7 +10032,7 @@
         <w:t>in silico</w:t>
       </w:r>
       <w:r>
-        <w:t xml:space="preserve"> cohort of calcified coronary lesions, stress measures from a linear-elastic analysis of the untreated lesion ranked lesions for through-thickness calcium damage under IVL better than the cross-sectional Fujino score, but added no clear discrimination to geometry alone. The fracture outcome came from a separate nonlinear phase-field model, but both models share the lesion geometry and the calcium constants, and the calcium modulus was calibrated to a model-internal criterion. The results show what a mechanics digital twin can extract from pre-treatment geometry; whether this carries information for patients must be tested against OCT after IVL in patient-derived lesions.</w:t>
+        <w:t xml:space="preserve"> cohort of calcified coronary cross-sections, a stress measure from a linear-elastic analysis of the untreated lesion anticipated through-thickness damage onset under an equivalent IVL load in a separate nonlinear phase-field model, but added no clear discrimination to geometry alone on the core set. Part of this agreement is expected by construction, because the predictor approximates the damage-nucleation criterion of the outcome model and both models share the geometry and the constants. Its advantage over the cross-sectional Fujino score was clear only without a measurement tolerance at the score's arc cut-off. The model represents IVL as a static inflation and reproduces no effect specific to lithotripsy, and its calcium strength was set by calibration to a model-internal criterion. Whether pre-treatment mechanics carry information for patients must be tested against OCT after IVL in patient-derived lesions with a model that distinguishes the pulse from static loading.</w:t>
       </w:r>
     </w:p>
     <w:p>
@@ -10156,12 +10198,12 @@
         <w:t>8</w:t>
       </w:r>
       <w:r>
-        <w:t>, 461–471.</w:t>
+        <w:t>, 461–471. https://doi.org/10.1016/j.jcmg.2015.02.003.</w:t>
       </w:r>
     </w:p>
     <w:p>
       <w:r>
-        <w:t xml:space="preserve">2. Fujino, A.; Mintz, G. S.; Matsumura, M.; et al. A New Optical Coherence Tomography-Based Calcium Scoring System to Predict Stent Underexpansion. </w:t>
+        <w:t xml:space="preserve">2. Fujino, A.; Mintz, G. S.; Matsumura, M.; Lee, T.; Kim, S. Y.; Hoshino, M.; Usui, E.; Yonetsu, T.; Haag, E. S.; Shlofmitz, R. A.; Kakuta, T.; Maehara, A. A New Optical Coherence Tomography-Based Calcium Scoring System to Predict Stent Underexpansion. </w:t>
       </w:r>
       <w:r>
         <w:rPr>
@@ -10193,7 +10235,7 @@
     </w:p>
     <w:p>
       <w:r>
-        <w:t xml:space="preserve">3. Fujino, A.; Mintz, G. S.; Lee, T.; et al. Predictors of Calcium Fracture Derived From Balloon Angioplasty and its Effect on Stent Expansion Assessed by Optical Coherence Tomography. </w:t>
+        <w:t xml:space="preserve">3. Fujino, A.; Mintz, G. S.; Lee, T.; Hoshino, M.; Usui, E.; Kanaji, Y.; et al. Predictors of Calcium Fracture Derived From Balloon Angioplasty and its Effect on Stent Expansion Assessed by Optical Coherence Tomography. </w:t>
       </w:r>
       <w:r>
         <w:rPr>
@@ -10225,7 +10267,7 @@
     </w:p>
     <w:p>
       <w:r>
-        <w:t xml:space="preserve">4. Authors to be confirmed. Predictors for Calcium Fracture With a Novel Cutting Balloon: An Optical Coherence Tomography Study. </w:t>
+        <w:t xml:space="preserve">4. Kurata, N.; Ishihara, T.; Iida, O.; Tsujimura, T.; Ito, K.; Hata, Y.; Toyoshima, T.; Higashino, N.; Nakao, S.; Mano, T. Predictors for Calcium Fracture With a Novel Cutting Balloon: An Optical Coherence Tomography Study. </w:t>
       </w:r>
       <w:r>
         <w:rPr>
@@ -10243,7 +10285,16 @@
         <w:t>2022</w:t>
       </w:r>
       <w:r>
-        <w:t>. https://doi.org/10.1016/j.jcin.2022.02.017.</w:t>
+        <w:t xml:space="preserve">, </w:t>
+      </w:r>
+      <w:r>
+        <w:rPr>
+          <w:i/>
+        </w:rPr>
+        <w:t>15</w:t>
+      </w:r>
+      <w:r>
+        <w:t>, 904–906. https://doi.org/10.1016/j.jcin.2022.02.017.</w:t>
       </w:r>
     </w:p>
     <w:p>
@@ -10312,7 +10363,7 @@
     </w:p>
     <w:p>
       <w:r>
-        <w:t xml:space="preserve">7. Karimi Galougahi, K.; et al. Calcific Plaque Modification by Acoustic Shock Waves: Intravascular Lithotripsy in Coronary Interventions. </w:t>
+        <w:t xml:space="preserve">7. Karimi Galougahi, K.; Patel, S.; Shlofmitz, R. A.; Maehara, A.; Kereiakes, D. J.; Hill, J. M.; Stone, G. W.; Ali, Z. A. Calcific Plaque Modification by Acoustic Shock Waves: Intravascular Lithotripsy in Coronary Interventions. </w:t>
       </w:r>
       <w:r>
         <w:rPr>
@@ -10330,12 +10381,21 @@
         <w:t>2021</w:t>
       </w:r>
       <w:r>
-        <w:t>. https://doi.org/10.1161/CIRCINTERVENTIONS.120.009354.</w:t>
+        <w:t xml:space="preserve">, </w:t>
+      </w:r>
+      <w:r>
+        <w:rPr>
+          <w:i/>
+        </w:rPr>
+        <w:t>14</w:t>
+      </w:r>
+      <w:r>
+        <w:t>, e009354. https://doi.org/10.1161/CIRCINTERVENTIONS.120.009354.</w:t>
       </w:r>
     </w:p>
     <w:p>
       <w:r>
-        <w:t xml:space="preserve">8. Ali, Z. A.; et al. Safety and Effectiveness of Coronary Intravascular Lithotripsy for Treatment of Severely Calcified Coronary Stenoses: The Disrupt CAD II Study. </w:t>
+        <w:t xml:space="preserve">8. Ali, Z. A.; Nef, H.; Escaned, J.; Werner, N.; Banning, A. P.; Hill, J. M.; De Bruyne, B.; Montorfano, M.; Lefevre, T.; Stone, G. W.; et al. Safety and Effectiveness of Coronary Intravascular Lithotripsy for Treatment of Severely Calcified Coronary Stenoses: The Disrupt CAD II Study. </w:t>
       </w:r>
       <w:r>
         <w:rPr>
@@ -10367,7 +10427,7 @@
     </w:p>
     <w:p>
       <w:r>
-        <w:t xml:space="preserve">9. Hill, J. M.; et al. Intravascular Lithotripsy for Treatment of Severely Calcified Coronary Artery Disease. </w:t>
+        <w:t xml:space="preserve">9. Hill, J. M.; Kereiakes, D. J.; Shlofmitz, R. A.; Klein, A. J.; Riley, R. F.; Price, M. J.; Herrmann, H. C.; Bachinsky, W.; Waksman, R.; Stone, G. W.; Disrupt CAD III Investigators. Intravascular Lithotripsy for Treatment of Severely Calcified Coronary Artery Disease. </w:t>
       </w:r>
       <w:r>
         <w:rPr>
@@ -10385,12 +10445,21 @@
         <w:t>2020</w:t>
       </w:r>
       <w:r>
-        <w:t>. https://doi.org/10.1016/j.jacc.2020.09.603.</w:t>
+        <w:t xml:space="preserve">, </w:t>
+      </w:r>
+      <w:r>
+        <w:rPr>
+          <w:i/>
+        </w:rPr>
+        <w:t>76</w:t>
+      </w:r>
+      <w:r>
+        <w:t>, 2635–2646. https://doi.org/10.1016/j.jacc.2020.09.603.</w:t>
       </w:r>
     </w:p>
     <w:p>
       <w:r>
-        <w:t xml:space="preserve">10. Authors to be confirmed. TCT-120: Pooled Optical Coherence Tomography Analysis of the Disrupt CAD Studies. </w:t>
+        <w:t xml:space="preserve">10. Ali, Z.; Hill, J.; Saito, S.; et al. TCT-120 Optical Coherence Tomography Characterization of Shockwave Intravascular Lithotripsy for Treatment of Calcified Coronary Lesions: Patient-Level Pooled Analysis of the Disrupt CAD OCT Substudies. </w:t>
       </w:r>
       <w:r>
         <w:rPr>
@@ -10408,12 +10477,21 @@
         <w:t>2021</w:t>
       </w:r>
       <w:r>
-        <w:t>. https://doi.org/10.1016/j.jacc.2021.09.970.</w:t>
+        <w:t xml:space="preserve">, </w:t>
+      </w:r>
+      <w:r>
+        <w:rPr>
+          <w:i/>
+        </w:rPr>
+        <w:t>78</w:t>
+      </w:r>
+      <w:r>
+        <w:t>, B50–B51. https://doi.org/10.1016/j.jacc.2021.09.970.</w:t>
       </w:r>
     </w:p>
     <w:p>
       <w:r>
-        <w:t xml:space="preserve">11. Authors to be confirmed. Outcomes of Coronary Intravascular Lithotripsy for the Treatment of Calcified Nodules: A Pooled Analysis of the Disrupt CAD Studies. </w:t>
+        <w:t xml:space="preserve">11. Ali, Z. A.; Shin, D.; Singh, M.; Malik, S.; Sakai, K.; Honton, B.; Kereiakes, D. J.; Hill, J. M.; Saito, S.; Di Mario, C.; Gonzalo, N.; Riley, R. F.; Maehara, A.; Matsumura, M.; Hokama, J.; West, N. E. J.; Stone, G. W.; Shlofmitz, R. A.; et al. Outcomes of Coronary Intravascular Lithotripsy for the Treatment of Calcified Nodules: A Pooled Analysis of the Disrupt CAD Studies. </w:t>
       </w:r>
       <w:r>
         <w:rPr>
@@ -10431,7 +10509,16 @@
         <w:t>2024</w:t>
       </w:r>
       <w:r>
-        <w:t>. https://doi.org/10.4244/EIJ-D-24-00282.</w:t>
+        <w:t xml:space="preserve">, </w:t>
+      </w:r>
+      <w:r>
+        <w:rPr>
+          <w:i/>
+        </w:rPr>
+        <w:t>20</w:t>
+      </w:r>
+      <w:r>
+        <w:t>, e1454–e1464. https://doi.org/10.4244/EIJ-D-24-00282.</w:t>
       </w:r>
     </w:p>
     <w:p>
@@ -10468,7 +10555,7 @@
     </w:p>
     <w:p>
       <w:r>
-        <w:t xml:space="preserve">13. Authors to be confirmed. Intravascular Laser Lithotripsy for Calcium Fracture in Human Coronary Arteries. </w:t>
+        <w:t xml:space="preserve">13. Gruslova, A. B.; Katta, N.; Nolen, D.; Jenney, S.; Vela, D.; Buja, M.; Cilingiroglu, M.; Seddighi, Y.; Han, H. C.; Milner, T. E.; Feldman, M. D. Intravascular Laser Lithotripsy for Calcium Fracture in Human Coronary Arteries. </w:t>
       </w:r>
       <w:r>
         <w:rPr>
@@ -10477,12 +10564,30 @@
         <w:t>EuroIntervention</w:t>
       </w:r>
       <w:r>
-        <w:t>.</w:t>
+        <w:t xml:space="preserve"> </w:t>
+      </w:r>
+      <w:r>
+        <w:rPr>
+          <w:b/>
+        </w:rPr>
+        <w:t>2023</w:t>
+      </w:r>
+      <w:r>
+        <w:t xml:space="preserve">, </w:t>
+      </w:r>
+      <w:r>
+        <w:rPr>
+          <w:i/>
+        </w:rPr>
+        <w:t>19</w:t>
+      </w:r>
+      <w:r>
+        <w:t>, e913–e922. https://doi.org/10.4244/EIJ-D-23-00487.</w:t>
       </w:r>
     </w:p>
     <w:p>
       <w:r>
-        <w:t xml:space="preserve">14. Sato, ?; et al. A Revised Optical Coherence Tomography-Derived Calcium Score to Predict Stent Underexpansion in Severely Calcified Lesions. </w:t>
+        <w:t xml:space="preserve">14. Sato, T.; Matsumura, M.; Yamamoto, K.; Sugizaki, Y.; Shlofmitz, E.; Moses, J. W.; Khalique, O. K.; Thomas, S. V.; Malik, S.; Dakroub, A.; Singh, M.; Shin, D.; Cohen, D. J.; Mintz, G. S.; Shlofmitz, R. A.; Jeremias, A.; Ali, Z. A.; Maehara, A. A Revised Optical Coherence Tomography-Derived Calcium Score to Predict Stent Underexpansion in Severely Calcified Lesions. </w:t>
       </w:r>
       <w:r>
         <w:rPr>
@@ -10500,12 +10605,21 @@
         <w:t>2025</w:t>
       </w:r>
       <w:r>
-        <w:t>. https://doi.org/10.1016/j.jcin.2024.12.001.</w:t>
+        <w:t xml:space="preserve">, </w:t>
+      </w:r>
+      <w:r>
+        <w:rPr>
+          <w:i/>
+        </w:rPr>
+        <w:t>18</w:t>
+      </w:r>
+      <w:r>
+        <w:t>, 622–633. https://doi.org/10.1016/j.jcin.2024.12.001.</w:t>
       </w:r>
     </w:p>
     <w:p>
       <w:r>
-        <w:t xml:space="preserve">15. Gharaibeh, Y.; et al. Prediction of Stent Under-Expansion in Calcified Coronary Arteries Using Machine Learning on Intravascular Optical Coherence Tomography Images. </w:t>
+        <w:t xml:space="preserve">15. Gharaibeh, Y.; Lee, J.; Zimin, V. N.; Kolluru, C.; Dallan, L. A. P.; Pereira, G. T. R.; Vergara-Martel, A.; Kim, J. N.; Hoori, A.; Dong, P.; Gamage, P. T.; Gu, L.; Bezerra, H. G.; Al-Kindi, S.; Wilson, D. L. Prediction of Stent Under-Expansion in Calcified Coronary Arteries Using Machine Learning on Intravascular Optical Coherence Tomography Images. </w:t>
       </w:r>
       <w:r>
         <w:rPr>
@@ -10532,7 +10646,7 @@
         <w:t>13</w:t>
       </w:r>
       <w:r>
-        <w:t>. https://doi.org/10.1038/s41598-023-44610-9.</w:t>
+        <w:t>, 18110. https://doi.org/10.1038/s41598-023-44610-9.</w:t>
       </w:r>
     </w:p>
     <w:p>
@@ -10596,7 +10710,7 @@
         <w:t>38</w:t>
       </w:r>
       <w:r>
-        <w:t>, 1574–1581.</w:t>
+        <w:t>, 1574–1581. https://doi.org/10.1016/j.jbiomech.2004.07.022.</w:t>
       </w:r>
     </w:p>
     <w:p>
@@ -10665,7 +10779,7 @@
     </w:p>
     <w:p>
       <w:r>
-        <w:t xml:space="preserve">20. Dong, P.; et al. Load-Sharing Characteristics of Stenting and Post-Dilation in Heavily Calcified Coronary Artery. </w:t>
+        <w:t xml:space="preserve">20. Dong, P.; Colmenarez, J.; Lee, J.; Shafiabadi Hassani, N.; Wilson, D. L.; Bezerra, H. G.; Gu, L. Load-Sharing Characteristics of Stenting and Post-Dilation in Heavily Calcified Coronary Artery. </w:t>
       </w:r>
       <w:r>
         <w:rPr>
@@ -10747,7 +10861,16 @@
         <w:t>2021</w:t>
       </w:r>
       <w:r>
-        <w:t>. https://doi.org/10.1371/journal.pone.0251404.</w:t>
+        <w:t xml:space="preserve">, </w:t>
+      </w:r>
+      <w:r>
+        <w:rPr>
+          <w:i/>
+        </w:rPr>
+        <w:t>16</w:t>
+      </w:r>
+      <w:r>
+        <w:t>, e0251404. https://doi.org/10.1371/journal.pone.0251404.</w:t>
       </w:r>
     </w:p>
     <w:p>
@@ -10770,7 +10893,16 @@
         <w:t>2023</w:t>
       </w:r>
       <w:r>
-        <w:t>. https://doi.org/10.1177/09544119231157853.</w:t>
+        <w:t xml:space="preserve">, </w:t>
+      </w:r>
+      <w:r>
+        <w:rPr>
+          <w:i/>
+        </w:rPr>
+        <w:t>237</w:t>
+      </w:r>
+      <w:r>
+        <w:t>, 443–450. https://doi.org/10.1177/09544119231157853.</w:t>
       </w:r>
     </w:p>
     <w:p>
@@ -10793,7 +10925,16 @@
         <w:t>2025</w:t>
       </w:r>
       <w:r>
-        <w:t>. https://doi.org/10.1007/s10237-024-01923-6.</w:t>
+        <w:t xml:space="preserve">, </w:t>
+      </w:r>
+      <w:r>
+        <w:rPr>
+          <w:i/>
+        </w:rPr>
+        <w:t>24</w:t>
+      </w:r>
+      <w:r>
+        <w:t>, 539–552. https://doi.org/10.1007/s10237-024-01923-6.</w:t>
       </w:r>
     </w:p>
     <w:p>
@@ -10825,7 +10966,7 @@
         <w:t>48</w:t>
       </w:r>
       <w:r>
-        <w:t>, 797–826.</w:t>
+        <w:t>, 797–826. https://doi.org/10.1016/S0022-5096(99)00028-9.</w:t>
       </w:r>
     </w:p>
     <w:p>
@@ -10880,7 +11021,16 @@
         <w:t>2018</w:t>
       </w:r>
       <w:r>
-        <w:t>.</w:t>
+        <w:t xml:space="preserve">, </w:t>
+      </w:r>
+      <w:r>
+        <w:rPr>
+          <w:i/>
+        </w:rPr>
+        <w:t>110</w:t>
+      </w:r>
+      <w:r>
+        <w:t>, 80–99. https://doi.org/10.1016/j.jmps.2017.09.006.</w:t>
       </w:r>
     </w:p>
     <w:p>
@@ -10912,7 +11062,7 @@
         <w:t>312</w:t>
       </w:r>
       <w:r>
-        <w:t>, 542–566.</w:t>
+        <w:t>, 542–566. https://doi.org/10.1016/j.cma.2016.04.007.</w:t>
       </w:r>
     </w:p>
     <w:p>
@@ -10981,7 +11131,7 @@
     </w:p>
     <w:p>
       <w:r>
-        <w:t xml:space="preserve">31. Gharaibeh, Y.; et al. Deep Learning Segmentation of Coronary Calcified Plaque from Intravascular Optical Coherence Tomography (IVOCT) Images with Application to Finite Element Modeling of Stent Deployment. </w:t>
+        <w:t xml:space="preserve">31. Gharaibeh, Y.; Dong, P.; Prabhu, D.; Kolluru, C.; Lee, J.; Zimin, V.; Mozafari, H.; Bizzera, H.; Gu, L.; Wilson, D. Deep Learning Segmentation of Coronary Calcified Plaque from Intravascular Optical Coherence Tomography (IVOCT) Images with Application to Finite Element Modeling of Stent Deployment. </w:t>
       </w:r>
       <w:r>
         <w:rPr>
@@ -11008,12 +11158,12 @@
         <w:t>10951</w:t>
       </w:r>
       <w:r>
-        <w:t>. https://doi.org/10.1117/12.2515256.</w:t>
+        <w:t>, 109511C. https://doi.org/10.1117/12.2515256.</w:t>
       </w:r>
     </w:p>
     <w:p>
       <w:r>
-        <w:t xml:space="preserve">32. Corral-Acero, J.; et al. The ‘Digital Twin’ to Enable the Vision of Precision Cardiology. </w:t>
+        <w:t xml:space="preserve">32. Corral-Acero, J.; Margara, F.; Marciniak, M.; Rodero, C.; Loncaric, F.; Feng, Y.; Gilbert, A.; Fernandes, J. F.; Bukhari, H. A.; Wajdan, A.; Villegas Martinez, M.; Sousa Santos, M.; Shamohammdi, M.; Luo, H.; Westphal, P.; Leeson, P.; DiAchille, P.; Gurev, V.; Mayr, M.; Geris, L.; Pathmanathan, P.; Morrison, T.; Cornelussen, R.; Prinzen, F.; Delhaas, T.; Doltra, A.; Sitges, M.; Vigmond, E. J.; Zacur, E.; Grau, V.; Rodriguez, B.; Remme, E. W.; Niederer, S.; Mortier, P.; McLeod, K.; Potse, M.; Pueyo, E.; Bueno-Orovio, A.; Lamata, P. The ‘Digital Twin’ to Enable the Vision of Precision Cardiology. </w:t>
       </w:r>
       <w:r>
         <w:rPr>
@@ -11104,12 +11254,12 @@
         <w:t>27</w:t>
       </w:r>
       <w:r>
-        <w:t>, 195–204.</w:t>
+        <w:t>, 195–204. https://doi.org/10.1016/0021-9290(94)90209-7.</w:t>
       </w:r>
     </w:p>
     <w:p>
       <w:r>
-        <w:t xml:space="preserve">35. Authors to be confirmed. Effect of Calcification Modulus and Geometry on Stress in Models of Calcified Atherosclerotic Plaque. </w:t>
+        <w:t xml:space="preserve">35. Buffinton, C. M.; Ebenstein, D. M. Effect of Calcification Modulus and Geometry on Stress in Models of Calcified Atherosclerotic Plaque. </w:t>
       </w:r>
       <w:r>
         <w:rPr>
@@ -11127,7 +11277,16 @@
         <w:t>2014</w:t>
       </w:r>
       <w:r>
-        <w:t>. https://doi.org/10.1007/s13239-014-0186-6.</w:t>
+        <w:t xml:space="preserve">, </w:t>
+      </w:r>
+      <w:r>
+        <w:rPr>
+          <w:i/>
+        </w:rPr>
+        <w:t>5</w:t>
+      </w:r>
+      <w:r>
+        <w:t>, 244–260. https://doi.org/10.1007/s13239-014-0186-6.</w:t>
       </w:r>
     </w:p>
     <w:p>
@@ -11159,12 +11318,12 @@
         <w:t>126</w:t>
       </w:r>
       <w:r>
-        <w:t>, 657–665.</w:t>
+        <w:t>, 657–665. https://doi.org/10.1115/1.1800557.</w:t>
       </w:r>
     </w:p>
     <w:p>
       <w:r>
-        <w:t xml:space="preserve">37. Sugiyama, T.; Yamamoto, E.; Fracassi, F.; et al. Calcified Plaques in Patients With Acute Coronary Syndromes. </w:t>
+        <w:t xml:space="preserve">37. Sugiyama, T.; Yamamoto, E.; Fracassi, F.; Lee, H.; Yonetsu, T.; et al. Calcified Plaques in Patients With Acute Coronary Syndromes. </w:t>
       </w:r>
       <w:r>
         <w:rPr>
@@ -11182,12 +11341,21 @@
         <w:t>2019</w:t>
       </w:r>
       <w:r>
-        <w:t>.</w:t>
+        <w:t xml:space="preserve">, </w:t>
+      </w:r>
+      <w:r>
+        <w:rPr>
+          <w:i/>
+        </w:rPr>
+        <w:t>12</w:t>
+      </w:r>
+      <w:r>
+        <w:t>, 531–540. https://doi.org/10.1016/j.jcin.2018.12.013.</w:t>
       </w:r>
     </w:p>
     <w:p>
       <w:r>
-        <w:t xml:space="preserve">38. Lee, J.; et al. Segmentation of Coronary Calcified Plaque in Intravascular OCT Images Using a Two-Step Deep Learning Approach. </w:t>
+        <w:t xml:space="preserve">38. Lee, J.; Gharaibeh, Y.; Kolluru, C.; Zimin, V. N.; Dallan, L. A. P.; Kim, J. N.; Bezerra, H. G.; Wilson, D. L. Segmentation of Coronary Calcified Plaque in Intravascular OCT Images Using a Two-Step Deep Learning Approach. </w:t>
       </w:r>
       <w:r>
         <w:rPr>
@@ -11205,7 +11373,16 @@
         <w:t>2020</w:t>
       </w:r>
       <w:r>
-        <w:t>.</w:t>
+        <w:t xml:space="preserve">, </w:t>
+      </w:r>
+      <w:r>
+        <w:rPr>
+          <w:i/>
+        </w:rPr>
+        <w:t>8</w:t>
+      </w:r>
+      <w:r>
+        <w:t>, 225581–225593. https://doi.org/10.1109/ACCESS.2020.3045285.</w:t>
       </w:r>
     </w:p>
     <w:p>
@@ -11228,12 +11405,21 @@
         <w:t>2025</w:t>
       </w:r>
       <w:r>
-        <w:t>. https://doi.org/10.1016/j.jscai.2025.102616.</w:t>
+        <w:t xml:space="preserve">, </w:t>
+      </w:r>
+      <w:r>
+        <w:rPr>
+          <w:i/>
+        </w:rPr>
+        <w:t>4</w:t>
+      </w:r>
+      <w:r>
+        <w:t>, 102616. https://doi.org/10.1016/j.jscai.2025.102616.</w:t>
       </w:r>
     </w:p>
     <w:p>
       <w:r>
-        <w:t xml:space="preserve">40. Konishi, ?; et al. The Histological Analysis of the Coronary Medial Thickness: Implications for Percutaneous Coronary Intervention. </w:t>
+        <w:t xml:space="preserve">40. Konishi, T.; Ghosh, S. K. B.; Sato, Y.; Kawakami, R.; Kawai, K.; Vozenilek, A. E.; Xu, W.; Bellissard, A.; Giasolli, R.; Chahal, D.; Virmani, R.; Finn, A. V. The Histological Analysis of the Coronary Medial Thickness: Implications for Percutaneous Coronary Intervention. </w:t>
       </w:r>
       <w:r>
         <w:rPr>
@@ -11265,7 +11451,7 @@
     </w:p>
     <w:p>
       <w:r>
-        <w:t xml:space="preserve">41. Rioufol, G.; et al. Adventitia Measurement in Coronary Artery: An in Vivo Intravascular Ultrasound Study. </w:t>
+        <w:t xml:space="preserve">41. Rioufol, G.; Elbaz, M.; Dubreuil, O.; Tabib, A.; Finet, G. Adventitia Measurement in Coronary Artery: An in Vivo Intravascular Ultrasound Study. </w:t>
       </w:r>
       <w:r>
         <w:rPr>
@@ -11292,12 +11478,30 @@
         <w:t>92</w:t>
       </w:r>
       <w:r>
-        <w:t>, 985–986.</w:t>
+        <w:t>, 985–986. https://doi.org/10.1136/hrt.2005.062711.</w:t>
       </w:r>
     </w:p>
     <w:p>
       <w:r>
-        <w:t>42. Authors to be confirmed. Volumetric Characterization of Human Coronary Calcification by Frequency-Domain Optical Coherence Tomography.</w:t>
+        <w:t xml:space="preserve">42. Mehanna, E.; Bezerra, H. G.; Prabhu, D.; Brandt, E.; Chamié, D.; Yamamoto, H.; Attizzani, G. F.; Tahara, S.; Van Ditzhuijzen, N.; Fujino, Y.; Kanaya, T.; Stefano, G.; Wang, W.; Gargesha, M.; Wilson, D.; Costa, M. A. Volumetric Characterization of Human Coronary Calcification by Frequency-Domain Optical Coherence Tomography. </w:t>
+      </w:r>
+      <w:r>
+        <w:rPr>
+          <w:b/>
+        </w:rPr>
+        <w:t>2013</w:t>
+      </w:r>
+      <w:r>
+        <w:t xml:space="preserve">, </w:t>
+      </w:r>
+      <w:r>
+        <w:rPr>
+          <w:i/>
+        </w:rPr>
+        <w:t>77</w:t>
+      </w:r>
+      <w:r>
+        <w:t>, 2334–2340. https://doi.org/10.1253/circj.CJ-12-1458.</w:t>
       </w:r>
     </w:p>
     <w:p>
@@ -11325,7 +11529,25 @@
     </w:p>
     <w:p>
       <w:r>
-        <w:t>44. Authors to be confirmed. CLIMA Study: Optical Coherence Tomography of the Proximal Left Anterior Descending Artery (High-Risk Lipid Arc).</w:t>
+        <w:t xml:space="preserve">44. Prati, F.; Romagnoli, E.; Gatto, L.; La Manna, A.; Burzotta, F.; Ozaki, Y.; Marco, V.; Boi, A.; Fineschi, M.; Fabbiocchi, F.; Taglieri, N.; Niccoli, G.; Trani, C.; Versaci, F.; et al. CLIMA Study: Optical Coherence Tomography of the Proximal Left Anterior Descending Artery (High-Risk Lipid Arc). </w:t>
+      </w:r>
+      <w:r>
+        <w:rPr>
+          <w:b/>
+        </w:rPr>
+        <w:t>2020</w:t>
+      </w:r>
+      <w:r>
+        <w:t xml:space="preserve">, </w:t>
+      </w:r>
+      <w:r>
+        <w:rPr>
+          <w:i/>
+        </w:rPr>
+        <w:t>41</w:t>
+      </w:r>
+      <w:r>
+        <w:t>, 383–391. https://doi.org/10.1093/eurheartj/ehz520.</w:t>
       </w:r>
     </w:p>
     <w:p>
@@ -11362,7 +11584,7 @@
         <w:t>79</w:t>
       </w:r>
       <w:r>
-        <w:t>, 1309–1331.</w:t>
+        <w:t>, 1309–1331. https://doi.org/10.1002/nme.2579.</w:t>
       </w:r>
     </w:p>
     <w:p>
@@ -11431,7 +11653,7 @@
     </w:p>
     <w:p>
       <w:r>
-        <w:t xml:space="preserve">49. Authors to be confirmed. Mapping Elasticity Moduli of Atherosclerotic Plaque in Situ via Atomic Force Microscopy. </w:t>
+        <w:t xml:space="preserve">49. Tracqui; Broisat; Toczek, J.; Mesnier; Ohayon; Riou. Mapping Elasticity Moduli of Atherosclerotic Plaque in Situ via Atomic Force Microscopy. </w:t>
       </w:r>
       <w:r>
         <w:rPr>
@@ -11449,12 +11671,21 @@
         <w:t>2011</w:t>
       </w:r>
       <w:r>
-        <w:t>.</w:t>
+        <w:t xml:space="preserve">, </w:t>
+      </w:r>
+      <w:r>
+        <w:rPr>
+          <w:i/>
+        </w:rPr>
+        <w:t>174</w:t>
+      </w:r>
+      <w:r>
+        <w:t>, 115–123. https://doi.org/10.1016/j.jsb.2011.01.010.</w:t>
       </w:r>
     </w:p>
     <w:p>
       <w:r>
-        <w:t xml:space="preserve">50. Kawai, K.; et al. Histology, OCT, and Micro-CT Evaluation of Coronary Calcification Treated With Intravascular Lithotripsy: Atherosclerotic Cadaver Study. </w:t>
+        <w:t xml:space="preserve">50. Kawai, K.; Sato, Y.; Hokama, J. Y.; et al. Histology, OCT, and Micro-CT Evaluation of Coronary Calcification Treated With Intravascular Lithotripsy: Atherosclerotic Cadaver Study. </w:t>
       </w:r>
       <w:r>
         <w:rPr>
@@ -11486,7 +11717,25 @@
     </w:p>
     <w:p>
       <w:r>
-        <w:t>51. Whelton, P. K.; et al. 2017 ACC/AHA Guideline for the Prevention, Detection, Evaluation, and Management of High Blood Pressure in Adults.</w:t>
+        <w:t xml:space="preserve">51. Whelton, P. K.; Carey, R. M.; Aronow, W. S.; Casey, D. E.; Collins, K. J.; Dennison Himmelfarb, C.; DePalma, S. M.; Gidding, S.; Jamerson, K. A.; Jones, D. W.; MacLaughlin, E. J.; Muntner, P.; Ovbiagele, B.; Smith, S. C.; Spencer, C. C.; Stafford, R. S.; Taler, S. J.; Thomas, R. J.; Williams, K. A.; Williamson, J. D.; Wright, J. T. 2017 ACC/AHA Guideline for the Prevention, Detection, Evaluation, and Management of High Blood Pressure in Adults. </w:t>
+      </w:r>
+      <w:r>
+        <w:rPr>
+          <w:b/>
+        </w:rPr>
+        <w:t>2018</w:t>
+      </w:r>
+      <w:r>
+        <w:t xml:space="preserve">, </w:t>
+      </w:r>
+      <w:r>
+        <w:rPr>
+          <w:i/>
+        </w:rPr>
+        <w:t>71</w:t>
+      </w:r>
+      <w:r>
+        <w:t>, e13–e115. https://doi.org/10.1161/HYP.0000000000000065.</w:t>
       </w:r>
     </w:p>
     <w:p>
@@ -11496,12 +11745,30 @@
     </w:p>
     <w:p>
       <w:r>
-        <w:t>53. Authors to be confirmed. Comparison of in Vivo Acute Stent Recoil between the Bioabsorbable Everolimus-Eluting Coronary Stent and the Everolimus-Eluting Cobalt Chromium Coronary Stent.</w:t>
+        <w:t xml:space="preserve">53. Tanimoto; et al. Comparison of in Vivo Acute Stent Recoil between the Bioabsorbable Everolimus-Eluting Coronary Stent and the Everolimus-Eluting Cobalt Chromium Coronary Stent. </w:t>
+      </w:r>
+      <w:r>
+        <w:rPr>
+          <w:b/>
+        </w:rPr>
+        <w:t>2007</w:t>
+      </w:r>
+      <w:r>
+        <w:t xml:space="preserve">, </w:t>
+      </w:r>
+      <w:r>
+        <w:rPr>
+          <w:i/>
+        </w:rPr>
+        <w:t>70</w:t>
+      </w:r>
+      <w:r>
+        <w:t>, 515–523. https://doi.org/10.1002/ccd.21136.</w:t>
       </w:r>
     </w:p>
     <w:p>
       <w:r>
-        <w:t xml:space="preserve">54. Brinton, T. J.; et al. Feasibility of Shockwave Coronary Intravascular Lithotripsy for the Treatment of Calcified Coronary Stenoses: First Description. </w:t>
+        <w:t xml:space="preserve">54. Brinton, T. J.; Ali, Z. A.; Hill, J. M.; et al. Feasibility of Shockwave Coronary Intravascular Lithotripsy for the Treatment of Calcified Coronary Stenoses: First Description. </w:t>
       </w:r>
       <w:r>
         <w:rPr>
@@ -11519,12 +11786,30 @@
         <w:t>2019</w:t>
       </w:r>
       <w:r>
-        <w:t>. https://doi.org/10.1161/CIRCULATIONAHA.118.036531.</w:t>
+        <w:t xml:space="preserve">, </w:t>
+      </w:r>
+      <w:r>
+        <w:rPr>
+          <w:i/>
+        </w:rPr>
+        <w:t>139</w:t>
+      </w:r>
+      <w:r>
+        <w:t>, 834–836. https://doi.org/10.1161/CIRCULATIONAHA.118.036531.</w:t>
       </w:r>
     </w:p>
     <w:p>
       <w:r>
-        <w:t xml:space="preserve">55. Rooney, ?; et al. Speed of Sound in Excised Human and Canine Arteries (2–10 MHz). </w:t>
+        <w:t xml:space="preserve">55. Rooney; Gammell; Hestenes; Blankenhorn; Chin. Velocity of Sound in Arterial Tissue. </w:t>
+      </w:r>
+      <w:r>
+        <w:rPr>
+          <w:i/>
+        </w:rPr>
+        <w:t>Journal of the Acoustical Society of America</w:t>
+      </w:r>
+      <w:r>
+        <w:t xml:space="preserve"> </w:t>
       </w:r>
       <w:r>
         <w:rPr>
@@ -11538,7 +11823,16 @@
     </w:p>
     <w:p>
       <w:r>
-        <w:t xml:space="preserve">56. Rooney, ?; et al. Speed of Sound in Excised Arterial Lesions at 37 °C. </w:t>
+        <w:t xml:space="preserve">56. Rooney, J. A.; Gammell, P. M.; Hestenes, J. D.; Chin, H. P.; Blankenhorn, D. H. Velocity and Attenuation of Sound in Arterial Tissues. </w:t>
+      </w:r>
+      <w:r>
+        <w:rPr>
+          <w:i/>
+        </w:rPr>
+        <w:t>Journal of the Acoustical Society of America</w:t>
+      </w:r>
+      <w:r>
+        <w:t xml:space="preserve"> </w:t>
       </w:r>
       <w:r>
         <w:rPr>
@@ -11580,7 +11874,7 @@
     </w:p>
     <w:p>
       <w:r>
-        <w:t xml:space="preserve">59. Authors to be confirmed. Minimizing Thermal Damage to Vascular Nerves While Drilling of Calcified Plaque. </w:t>
+        <w:t xml:space="preserve">59. Gholampour, S.; Hajirayat, K. Minimizing Thermal Damage to Vascular Nerves While Drilling of Calcified Plaque. </w:t>
       </w:r>
       <w:r>
         <w:rPr>
@@ -11598,26 +11892,53 @@
         <w:t>2019</w:t>
       </w:r>
       <w:r>
-        <w:t>. https://doi.org/10.1186/s13104-019-4381-2.</w:t>
+        <w:t xml:space="preserve">, </w:t>
+      </w:r>
+      <w:r>
+        <w:rPr>
+          <w:i/>
+        </w:rPr>
+        <w:t>12</w:t>
+      </w:r>
+      <w:r>
+        <w:t>, 338. https://doi.org/10.1186/s13104-019-4381-2.</w:t>
       </w:r>
     </w:p>
     <w:p>
       <w:r>
-        <w:t xml:space="preserve">60. Authors to be confirmed. [Stent-deployment finite element study with Ogden plaque models]. </w:t>
+        <w:t xml:space="preserve">60. Schiavone, A.; Zhao, L. A Study of Balloon Type, System Constraint and Artery Constitutive Model Used in Finite Element Simulation of Stent Deployment. </w:t>
+      </w:r>
+      <w:r>
+        <w:rPr>
+          <w:i/>
+        </w:rPr>
+        <w:t>Mechanics of Advanced Materials and Modern Processes</w:t>
+      </w:r>
+      <w:r>
+        <w:t xml:space="preserve"> </w:t>
       </w:r>
       <w:r>
         <w:rPr>
           <w:b/>
         </w:rPr>
-        <w:t>2014</w:t>
-      </w:r>
-      <w:r>
-        <w:t>. https://doi.org/10.1186/s40759-014-0002-x.</w:t>
+        <w:t>2015</w:t>
+      </w:r>
+      <w:r>
+        <w:t xml:space="preserve">, </w:t>
+      </w:r>
+      <w:r>
+        <w:rPr>
+          <w:i/>
+        </w:rPr>
+        <w:t>1</w:t>
+      </w:r>
+      <w:r>
+        <w:t>, 1. https://doi.org/10.1186/s40759-014-0002-x.</w:t>
       </w:r>
     </w:p>
     <w:p>
       <w:r>
-        <w:t xml:space="preserve">61. Authors to be confirmed. [Thermal model of atherosclerotic arteries]. </w:t>
+        <w:t xml:space="preserve">61. Ley, O.; Kim, T. Calculation of Arterial Wall Temperature in Atherosclerotic Arteries: Effect of Pulsatile Flow, Arterial Geometry, and Plaque Structure. </w:t>
       </w:r>
       <w:r>
         <w:rPr>
@@ -11626,6 +11947,15 @@
         <w:t>BioMedical Engineering OnLine</w:t>
       </w:r>
       <w:r>
+        <w:t xml:space="preserve"> </w:t>
+      </w:r>
+      <w:r>
+        <w:rPr>
+          <w:b/>
+        </w:rPr>
+        <w:t>2007</w:t>
+      </w:r>
+      <w:r>
         <w:t>. https://doi.org/10.1186/1475-925X-6-8.</w:t>
       </w:r>
     </w:p>
@@ -11663,7 +11993,7 @@
     </w:p>
     <w:p>
       <w:r>
-        <w:t xml:space="preserve">63. Authors to be confirmed. Serum Marker and CT Characteristics of Coronary Calcified Nodule Assessed by Intravascular Ultrasound. </w:t>
+        <w:t xml:space="preserve">63. Li, J.; Jian, Z.; Wu, J.; Yang, J.; Guo, N.; Huang, X.; et al. Serum Marker and CT Characteristics of Coronary Calcified Nodule Assessed by Intravascular Ultrasound. </w:t>
       </w:r>
       <w:r>
         <w:rPr>
@@ -11736,7 +12066,16 @@
         <w:t>2010</w:t>
       </w:r>
       <w:r>
-        <w:t>.</w:t>
+        <w:t xml:space="preserve">, </w:t>
+      </w:r>
+      <w:r>
+        <w:rPr>
+          <w:i/>
+        </w:rPr>
+        <w:t>181</w:t>
+      </w:r>
+      <w:r>
+        <w:t>, 259–270. https://doi.org/10.1016/j.cpc.2009.09.018.</w:t>
       </w:r>
     </w:p>
     <w:p>

</xml_diff>

<commit_message>
Reframe the Introduction and abstract per D16
Co-Authored-By: Claude Opus 5.5 <noreply@anthropic.com>
Claude-Session: https://claude.ai/code/session_01Aym1Pq5EkMJZCbZQ4ygLdJ
</commit_message>
<xml_diff>
--- a/digital-twin-ivl/manuscript/manuscript.docx
+++ b/digital-twin-ivl/manuscript/manuscript.docx
@@ -7,7 +7,7 @@
         <w:pStyle w:val="Title"/>
       </w:pPr>
       <w:r>
-        <w:t>In Silico Digital Twins of Calcified Coronary Lesions under Intravascular Lithotripsy and Stenting</w:t>
+        <w:t>In Silico Models of Calcified Coronary Lesions under an Equivalent Lithotripsy Load: Linear Stress Predictors of Calcium Damage</w:t>
       </w:r>
     </w:p>
     <w:p>
@@ -23,7 +23,7 @@
         <w:t>Background/Objectives:</w:t>
       </w:r>
       <w:r>
-        <w:t xml:space="preserve"> Intravascular lithotripsy (IVL) fractures coronary calcium before stenting, but which lesions fracture is hard to predict from imaging scores. We asked whether stress computed before treatment anticipates calcium damage under IVL in </w:t>
+        <w:t xml:space="preserve"> Intravascular lithotripsy (IVL) fractures coronary calcium before stenting, but which lesions fracture is hard to predict from imaging scores. We asked how well a linear stress analysis before treatment anticipates calcium damage under an equivalent lithotripsy load in </w:t>
       </w:r>
       <w:r>
         <w:rPr>
@@ -41,7 +41,7 @@
         <w:t>Methods:</w:t>
       </w:r>
       <w:r>
-        <w:t xml:space="preserve"> Calcified coronary cross-sections formed a designed core set (34 lesions: calcium arc, thickness, morphology) and a sampled hold-out set (0 lesions). Candidate predictors came from a linear-elastic analysis of the untreated lesion; through-thickness calcium damage came from a separate nonlinear finite element model with a phase-field damage law under a quasi-static equivalent IVL load. Thresholds and a composite index were derived on the core set, tested unchanged on the hold-out set and compared with the optical coherence tomography (OCT) calcium score of Fujino. </w:t>
+        <w:t xml:space="preserve"> Calcified coronary cross-sections formed a designed core set (34 lesions: calcium arc, thickness, morphology) and a sampled hold-out set (0 lesions). Candidate predictors came from a linear-elastic analysis of the untreated lesion; through-thickness calcium damage came from a separate nonlinear finite element model with a phase-field damage law under a quasi-static equivalent IVL load. Core-set thresholds and a composite index were tested on the hold-out set and compared with the optical coherence tomography (OCT) calcium score of Fujino. </w:t>
       </w:r>
       <w:r>
         <w:rPr>
@@ -50,7 +50,7 @@
         <w:t>Results:</w:t>
       </w:r>
       <w:r>
-        <w:t xml:space="preserve"> Damage was all or nothing. On the core set, the non-local peak \sigma_1 had an apparent area under the receiver operating characteristic curve (AUC) of 0.96 (95% CI 0.89–1.00), the cross-sectional Fujino score 0.62, or 0.89 with a measurement tolerance at its arc cut-off. Leave-one-out AUCs were 0.95 for the composite index LIFT, 0.88 for geometry alone and 0.92 with mechanics added (not clearly different). On the hold-out set, the non-local peak \sigma_1 had an AUC of [pending] (95% CI [pending]–[pending]). The model reproduced the published association of fracture with calcium arc; IVL acted as a static load below the plain-balloon pressure, and the plain balloon damaged lesions that did not fracture in cadaver arteries. </w:t>
+        <w:t xml:space="preserve"> Damage was all or nothing. On the core set, the non-local peak \sigma_1 had an apparent area under the receiver operating characteristic curve (AUC) of 0.96 (95% CI 0.89–1.00), the cross-sectional Fujino score 0.62, or 0.89 with a measurement tolerance at its arc cut-off. Leave-one-out AUCs were 0.95 for the composite index LIFT, 0.88 for geometry alone and 0.92 with mechanics added (not clearly different). On the hold-out set, the non-local peak \sigma_1 had an AUC of [pending] (95% CI [pending]–[pending]). The model reproduced the published arc association, but the plain balloon damaged lesions that did not fracture in cadaver arteries. </w:t>
       </w:r>
       <w:r>
         <w:rPr>
@@ -70,7 +70,7 @@
         <w:t>Keywords:</w:t>
       </w:r>
       <w:r>
-        <w:t xml:space="preserve"> intravascular lithotripsy; coronary artery calcification; finite element analysis; phase-field fracture; digital twin; in silico; stent expansion; optical coherence tomography</w:t>
+        <w:t xml:space="preserve"> intravascular lithotripsy; coronary artery calcification; finite element analysis; phase-field fracture; computational biomechanics; in silico; stent expansion; optical coherence tomography</w:t>
       </w:r>
     </w:p>
     <w:p>
@@ -125,17 +125,17 @@
         <w:t>ex vivo</w:t>
       </w:r>
       <w:r>
-        <w:t xml:space="preserve"> laser-lithotripsy study [13] prescribed the fracture and simulated its effect, so fracture was an input rather than a prediction. Variational phase-field models of brittle fracture can predict whether and where a crack forms without a prescribed path: they regularise the crack over a length \ell [25], have robust staggered solvers [26], link crack nucleation to the material strength [27] and have been applied to arterial tissue [28]. Pipelines from intravascular images to FE models [29–31] bring lesion-specific digital twins, in the sense proposed for precision cardiology [32], within reach, and the in silico trial framework sets out how the credibility of such models is established [33].</w:t>
+        <w:t xml:space="preserve"> laser-lithotripsy study [13] prescribed the fracture and simulated its effect, so fracture was an input rather than a prediction. Variational phase-field models of brittle fracture can predict whether and where a crack forms without a prescribed path: they regularise the crack over a length \ell [25], have robust staggered solvers [26], link crack nucleation to the material strength [27] and have been applied to arterial tissue [28]. Pipelines from intravascular images to FE models [29–31] are a step towards lesion-specific digital twins in the sense proposed for precision cardiology [32], and the in silico trial framework sets out how the credibility of such models is established [33].</w:t>
       </w:r>
     </w:p>
     <w:p>
       <w:r>
-        <w:t>To our knowledge, no study has tested whether lesion-level mechanics from a computationally cheap pre-treatment analysis predict IVL-induced fracture better than geometry or the Fujino score, in a controlled cohort in which the fracture comes from a separate simulation. Clinical data cannot answer this directly: morphology and device use vary together, OCT under-detects fractures, and each lesion is treated once. The inputs are also uncertain: calcium moduli range from about 1.5 MPa in tissue-level tension [34] to the gigapascal range at the particle scale, reported from nanoindentation and summarised in a parametric FE study [35], and the only tissue-level fracture data for calcified plaque that we found come from one uniaxial tension study of human iliac plaques [36].</w:t>
+        <w:t>The maximum principal stress of an FE analysis has been used as a fracture indicator for cutting balloons [22], but whether a computationally cheap pre-treatment stress measure agrees with an explicit damage simulation of the same lesions, and whether it adds anything to the calcium geometry or to the Fujino score, has not been tested in a controlled cohort. Clinical data cannot answer this directly: morphology and device use vary together, OCT under-detects fractures, and each lesion is treated once. The inputs are also uncertain: calcium moduli range from about 1.5 MPa in tissue-level tension [34] to the gigapascal range at the particle scale, reported from nanoindentation and summarised in a parametric FE study [35], and the only tissue-level fracture data for calcified plaque that we found come from one uniaxial tension study of human iliac plaques [36].</w:t>
       </w:r>
     </w:p>
     <w:p>
       <w:r>
-        <w:t>This study addresses that question with a structured in silico cohort. A full factorial core set of 48 two-dimensional (2D) cross-sections combines 4 calcium arcs, 3 thicknesses and 4 morphologies (superficial sheet, deep sheet, calcified nodule, fragmented), a design choice based on the superficial and deep distribution of calcium [1] and the OCT classes of calcified plaque [37]; a hold-out set of 24 lesions is drawn by Latin hypercube sampling over continuous ranges of calcium arc, thickness and depth, lumen area and plaque eccentricity, with the four morphologies in equal numbers and a lipid pool under a fibrous cap assigned to half of the samples. Lesions are polar label maps in the OCT segmentation convention of [31,38], so that segmented images, together with an outer-wall contour, could enter the same pipeline (tested here only on synthetic masks). Predictors come from the geometry and from a linear-elastic analysis of the undamaged lesion under the IVL balloon pressure. Outcomes come from a separate nonlinear simulation with phase-field damage in the calcium, in which IVL is the quasi-static equivalent of a single acoustic pulse, followed by stent expansion. This equivalence represents the peak tensile response of the calcium to one pulse; it does not resolve the compressive wavefront or repeated pulses. The primary outcome is through-thickness calcium damage under IVL; crack number and pattern are not analysed. Predictors are evaluated by receiver operating characteristic (ROC) analysis with leave-one-out cross-validation (LOOCV) and bootstrap intervals, combined by penalised logistic regression on at most 3 mechanics predictors into the Lithotripsy-Induced Fracture Tendency (LIFT) index, and compared with the Fujino score computed from its angle and thickness criteria (at most 3 points, since the length criterion is not defined in a cross-section). Geometry-only and geometry-plus-mechanics models give the incremental value of mechanics. Thresholds and models are derived on the core set and applied unchanged to the hold-out set. The baseline calcium modulus is calibrated to a criterion internal to the model (the IVL balloon alone does not fracture the calcium, IVL does), and the published modulus range is covered by the sensitivity analysis. No patient data are used: the study offers verification against analytical solutions and under mesh refinement, consistency with published observations and sensitivity analysis of uncertain inputs, not a clinical test of the predictors.</w:t>
+        <w:t>This study addresses that question with a structured in silico cohort. A full factorial core set of 48 two-dimensional (2D) cross-sections combines 4 calcium arcs, 3 thicknesses and 4 morphologies (superficial sheet, deep sheet, calcified nodule, fragmented), a design choice based on the superficial and deep distribution of calcium [1] and the OCT classes of calcified plaque [37]; a hold-out set of 24 lesions is drawn by Latin hypercube sampling over continuous ranges of calcium arc, thickness and depth, lumen area and plaque eccentricity, with the four morphologies in equal numbers and a lipid pool under a fibrous cap assigned to half of the samples. Lesions are polar label maps in the OCT segmentation convention of [31,38], so that segmented images, together with an outer-wall contour, could enter the same pipeline (tested here only on synthetic masks). Predictors come from the geometry and from a linear-elastic analysis of the undamaged lesion under the IVL balloon pressure. Outcomes come from a separate nonlinear simulation with phase-field damage in the calcium under an equivalent lithotripsy load, followed by stent expansion. The equivalent load matches the peak calcium stress of one acoustic pulse in a linear model; in the nonlinear model it is a quasi-static inflation to a lesion-specific pressure, so it does not represent the pulse itself, the compressive wavefront or repeated pulses. The primary outcome is through-thickness calcium damage under the equivalent lithotripsy load; crack number and pattern are not analysed. The question is therefore how well a cheap linear stress measure anticipates nonlinear damage onset in a designed in silico cohort, not whether it predicts fracture in patients. Predictors are evaluated by receiver operating characteristic (ROC) analysis with leave-one-out cross-validation (LOOCV) and bootstrap intervals, combined by penalised logistic regression on at most 3 mechanics predictors into the Lithotripsy-Induced Fracture Tendency (LIFT) index, and compared with the Fujino score computed from its angle and thickness criteria (at most 3 points, since the length criterion is not defined in a cross-section). Geometry-only and geometry-plus-mechanics models give the incremental value of mechanics. Thresholds and models are derived on the core set and applied unchanged to the hold-out set. The baseline calcium modulus is calibrated to a criterion internal to the model (the IVL balloon alone does not fracture the calcium, IVL does); the published modulus range was swept on three pilot lesions for this calibration, and the sensitivity analyses vary the modulus near the calibrated value. No patient data are used: the study offers verification against analytical solutions and under mesh refinement, consistency with published observations and sensitivity analysis of uncertain inputs, not a clinical test of the predictors.</w:t>
       </w:r>
     </w:p>
     <w:p>
@@ -5227,7 +5227,7 @@
     </w:p>
     <w:p>
       <w:r>
-        <w:t>Two analyses were added after the first draft and are reported as post hoc. The label map measures the arc of the middle design level just below the strict arc cut-off of the Fujino score, so the Fujino comparison was repeated with an arc within 2° below the cut-off counted as meeting it. The core AUCs were also recomputed without the core lesions that share the geometry of the pilot lesions used to calibrate the calcium modulus.</w:t>
+        <w:t>Two analyses were added after the first draft and are reported as post hoc. The label map measures the arc of the middle design level just below the strict arc cut-off of the Fujino score, so the Fujino comparison was repeated with an arc within 2° below the cut-off counted as meeting it. The core AUCs were also recomputed without the core lesions that share the geometry of the pilot lesions used to calibrate the calcium modulus. Three further analyses were approved after the first draft (decision D18) and are also reported as post hoc: an outcome-criterion benchmark, the best predictor scaled to each lesion's peak equivalent IVL load and divided by the failure stress of the outcome model (it uses an input of the outcome model and is a benchmark, not a predictor), with its AUC and its classification at an index of one; the leave-one-out performance of the geometry, geometry + mechanics and a flexible geometry model (quadratic arc term and morphology indicators) at inverse penalties of 0.1, 1 and 10; and the outcome and predictor analyses of every core lesion repeated at calcium moduli of 210 and 634 MPa, the log-midpoints between the calibrated modulus and its neighbours in the pilot sweep.</w:t>
       </w:r>
     </w:p>
     <w:p>
@@ -5939,6 +5939,11 @@
     </w:p>
     <w:p>
       <w:r>
+        <w:t>Two further analyses were added after the first draft. In an outcome-criterion benchmark, the non-local peak \sigma_1 was scaled to each lesion's peak equivalent IVL load and divided by the failure stress of the outcome model; this linear failure index uses the IVL load, an input of the outcome model, and is a benchmark, not a predictor. It ranked the core lesions with an AUC of 0.97 (95% CI 0.89–1.00). Read as a failure criterion (index of one or more), it had a sensitivity of 0.19 and a specificity of 1.00: damage onset in the nonlinear model occurred below the linear failure load in most damaged lesions. With the inverse penalty of the logistic models set to 0.1, 1 and 10, the geometry + mechanics model had a lower leave-one-out log-loss than the geometry-only model at every penalty (0.434 versus 0.546; 0.384 versus 0.499; 0.580 versus 0.692), and a flexible geometry model with a quadratic arc term and morphology indicators did not discriminate better than the geometry-only model (leave-one-out AUC 0.88; 0.87; 0.88).</w:t>
+      </w:r>
+    </w:p>
+    <w:p>
+      <w:r>
         <w:t>On the hold-out set, with the core thresholds and models unchanged, the non-local peak \sigma_1 had an AUC of [pending] (95% CI [pending]–[pending]) and classified the lesions with a sensitivity of [pending] and a specificity of [pending]. LIFT had an AUC of [pending] (95% CI [pending]–[pending]), sensitivity [pending] and specificity [pending], and the Fujino score had an AUC of [pending] (95% CI [pending]–[pending]). The core-fit geometry + mechanics model minus the geometry-only model had a hold-out AUC difference of [pending] (95% CI [pending]–[pending]) (Figure 6b).</w:t>
       </w:r>
     </w:p>
@@ -9970,7 +9975,7 @@
         <w:t>in silico</w:t>
       </w:r>
       <w:r>
-        <w:t xml:space="preserve"> cohort of calcified coronary cross-sections, a stress measure from a linear-elastic analysis of the untreated lesion, the non-local peak \sigma_1, ranked lesions for through-thickness calcium damage in a separate nonlinear phase-field model with a core-set AUC of 0.96. The composite index LIFT did not clearly improve on this single predictor. Three features of the model qualify the result. First, the damage outcome was all or nothing, so it amounts to damage onset before the peak load. The predictor averages the maximum principal stress over a radius equal to the phase-field length, the length that governs damage nucleation in the AT1 model, and the area-fraction predictors use the outcome model's own failure strain and stress. A high AUC is therefore partly expected by construction: it measures how well the linear stress state of the untreated lesion anticipates nonlinear damage onset in the same model, not clinical accuracy. Second, all core lesions share one reference geometry and one set of material constants, so every mechanics predictor is a deterministic function of the three design factors. On the core set the comparison with the geometry-only model compares model forms, not information content: adding mechanics did not clearly change the leave-one-out AUC and lowered the out-of-fold log-loss and Brier score, at a fixed penalty. Only the hold-out set, in which lumen area, eccentricity and lipid vary, can show added information. Third, the advantage over the Fujino score depended on the 180° design level measuring just below the score's arc cut-off; with a measurement tolerance at the cut-off the two scores did not differ clearly (Section 3.3).</w:t>
+        <w:t xml:space="preserve"> cohort of calcified coronary cross-sections, a stress measure from a linear-elastic analysis of the untreated lesion, the non-local peak \sigma_1, ranked lesions for through-thickness calcium damage in a separate nonlinear phase-field model with a core-set AUC of 0.96. The composite index LIFT did not clearly improve on this single predictor. Three features of the model qualify the result. First, the damage outcome was all or nothing, so it amounts to damage onset before the peak load. The predictor averages the maximum principal stress over a radius equal to the phase-field length, the length that governs damage nucleation in the AT1 model, and the area-fraction predictors use the outcome model's own failure strain and stress. A high AUC is therefore partly expected by construction: it measures how well the linear stress state of the untreated lesion anticipates nonlinear damage onset in the same model, not clinical accuracy. In a post hoc benchmark, the outcome model's failure criterion evaluated with the linear stress at each lesion's peak load ranked the lesions as well as the best predictor (AUC 0.97 versus 0.96), although as an absolute criterion it missed most damaged lesions. Second, all core lesions share one reference geometry and one set of material constants, so every mechanics predictor is a deterministic function of the three design factors. On the core set the comparison with the geometry-only model compares model forms, not information content: adding mechanics did not clearly change the leave-one-out AUC and lowered the out-of-fold log-loss and Brier score, at a fixed penalty. Only the hold-out set, in which lumen area, eccentricity and lipid vary, can show added information. Third, the advantage over the Fujino score depended on the 180° design level measuring just below the score's arc cut-off; with a measurement tolerance at the cut-off the two scores did not differ clearly (Section 3.3).</w:t>
       </w:r>
     </w:p>
     <w:p>

</xml_diff>